<commit_message>
Report: bullet-point conclusions and plainer body prose
</commit_message>
<xml_diff>
--- a/report/report.docx
+++ b/report/report.docx
@@ -7449,7 +7449,7 @@
           <w:color w:val="000000"/>
           <w:sz w:val="24"/>
         </w:rPr>
-        <w:t>The purpose is to build the first overall picture of the air campaign as recorded in the data: when it happened, where it happened, who flew it and what was delivered. The approach is classical descriptive statistics: frequency tables for the categorical variables, summary statistics (mean, median, quartiles, standard deviation, skewness, kurtosis) for the numerical variables and one graph per question, all produced with R and ggplot2.</w:t>
+        <w:t>The first job is simple: see what the recorded air campaign actually looks like - when the deliveries happened, where they went, which aircraft flew them and what was dropped. Standard descriptive statistics are enough for this: frequency tables for the categorical variables, and mean, median, quartiles and skewness for the numbers, with one clear graph per question. Everything is produced in R with ggplot2.</w:t>
       </w:r>
     </w:p>
     <w:p>
@@ -7498,7 +7498,7 @@
           <w:color w:val="000000"/>
           <w:sz w:val="24"/>
         </w:rPr>
-        <w:t>2. Frequency tables of records by year, month, target country, aircraft group, period of day, source database and weapon class.</w:t>
+        <w:t>2. Frequency tables for year, month, target country, aircraft group, period of day, source database and weapon class.</w:t>
       </w:r>
     </w:p>
     <w:p>
@@ -7515,7 +7515,7 @@
           <w:color w:val="000000"/>
           <w:sz w:val="24"/>
         </w:rPr>
-        <w:t>3. Summary statistics of WEAPONS_DELIVERED, AIRCRAFT_NO, LOAD_LB, TGT_HOUR, LAT and LON, including the median, quartiles, interquartile range, skewness and kurtosis, because the distributions are strongly skewed.</w:t>
+        <w:t>3. Summary statistics of WEAPONS_DELIVERED, AIRCRAFT_NO, LOAD_LB, TGT_HOUR, LAT and LON - median and quartiles next to the mean, plus skewness and kurtosis, because every one of these variables is strongly skewed.</w:t>
       </w:r>
     </w:p>
     <w:p>
@@ -7532,7 +7532,7 @@
           <w:color w:val="000000"/>
           <w:sz w:val="24"/>
         </w:rPr>
-        <w:t>4. Graphs: bar chart of records per year; monthly time series by target country; histogram of weapons delivered; boxplots of weapons delivered by country; map of the target coordinates.</w:t>
+        <w:t>4. Five graphs: records per year, the monthly series by country, the histogram of weapons delivered, boxplots of weapons by country, and a map of the target coordinates.</w:t>
       </w:r>
     </w:p>
     <w:p>
@@ -7549,7 +7549,7 @@
           <w:color w:val="000000"/>
           <w:sz w:val="24"/>
         </w:rPr>
-        <w:t>5. Read each number with attention to the heavy skew (comparison of mean and median).</w:t>
+        <w:t>5. Read every number with the skew in mind and trust the median more than the mean when describing the typical record.</w:t>
       </w:r>
     </w:p>
     <w:p>
@@ -10507,7 +10507,7 @@
           <w:color w:val="000000"/>
           <w:sz w:val="24"/>
         </w:rPr>
-        <w:t>Inference: the war effort recorded in the data is concentrated in 1968-1971 (57.6% of all sample records); the sharp fall after 1972 matches the withdrawal of US forces and the end of large-scale bombing.</w:t>
+        <w:t>The recorded effort builds up from 1966, peaks in 1970 with 3,532 records, and falls away after 1972 (only 86 records in 1975). In total 57.6% of all records fall in 1968-71, the years of the heaviest fighting; the fall after 1972 matches the withdrawal of US forces.</w:t>
       </w:r>
     </w:p>
     <w:p>
@@ -10579,7 +10579,7 @@
           <w:color w:val="000000"/>
           <w:sz w:val="24"/>
         </w:rPr>
-        <w:t>Inference: the monthly profile differs by country - South Vietnam is a continuous high-volume theatre, while North Vietnam shows concentrated campaigns (1967-68 and 1972), which is consistent with the historical record of the two bombing campaigns against the North.</w:t>
+        <w:t>The countries behave differently. South Vietnam is a steady, high-volume theatre almost every month, while North Vietnam appears in concentrated bursts (1967-68 and again in 1972) - the two bombing campaigns against the North.</w:t>
       </w:r>
     </w:p>
     <w:p>
@@ -10651,7 +10651,7 @@
           <w:color w:val="000000"/>
           <w:sz w:val="24"/>
         </w:rPr>
-        <w:t>Inference: the distribution is extremely skewed: half of the records deliver 8 or fewer weapons, but 5.74% of the records deliver more than 100 (maximum 9,040). For this reason the median and the quartiles are reported next to the mean everywhere in this report.</w:t>
+        <w:t>Half of all records deliver 8 weapons or fewer, yet 5.74% deliver more than 100 (the largest single record is 9,040 weapons). A tail this heavy is exactly why the median is reported next to the mean everywhere in this report.</w:t>
       </w:r>
     </w:p>
     <w:p>
@@ -10723,7 +10723,7 @@
           <w:color w:val="000000"/>
           <w:sz w:val="24"/>
         </w:rPr>
-        <w:t>Inference: the typical (median) record is small in every country (8 weapons in South Vietnam, North Vietnam and Laos, 12 in Cambodia); the means are much larger than the medians in every country because of the long right tail. Comparing countries by mean would be misleading, by median they are similar.</w:t>
+        <w:t>The typical record looks similar everywhere: a median of 8 weapons in South Vietnam, North Vietnam and Laos, and 12 in Cambodia. The means differ much more - they are all inflated by the long right tail, and by different amounts - so the median is the fair basis for comparing countries.</w:t>
       </w:r>
     </w:p>
     <w:p>
@@ -10795,7 +10795,7 @@
           <w:color w:val="000000"/>
           <w:sz w:val="24"/>
         </w:rPr>
-        <w:t>Inference: the target coordinates form the expected map of the theatre: a dense band along the South Vietnamese coast and the Mekong delta, the Laos panhandle, and clusters in the North. The coordinates agree with the recorded target country, so the geographic information is internally consistent.</w:t>
+        <w:t>The plotted targets form the expected map of the war: a dense band along the South Vietnamese coast and the Mekong delta, the Laos panhandle, and clusters in the north. The coordinates agree with the recorded target countries, so the geography in the file is consistent.</w:t>
       </w:r>
     </w:p>
     <w:p>
@@ -10815,7 +10815,8 @@
     </w:p>
     <w:p>
       <w:pPr>
-        <w:spacing w:before="0" w:after="200"/>
+        <w:spacing w:before="0" w:after="60"/>
+        <w:ind w:left="425" w:hanging="312"/>
         <w:jc w:val="both"/>
       </w:pPr>
       <w:r>
@@ -10826,7 +10827,75 @@
           <w:color w:val="000000"/>
           <w:sz w:val="24"/>
         </w:rPr>
-        <w:t>The descriptive analysis shows a campaign concentrated in 1966-1972 with a clear peak in 1970; the main theatre is South Vietnam (53.5% of targets) followed by Laos (29.2%); the workhorse aircraft are the F-4 (24.1%), F-100 (14.4%) and A-1/A-4/A-37 families; bombing (BOMB class, 61.8% of records with a known class) is the dominant weapon; day records outnumber night records 13,786 to 5,380. Every numerical variable is strongly right-skewed, so medians and quartiles describe the typical record better than means.</w:t>
+        <w:t>•  The recorded campaign builds up in 1966-68, peaks in 1970 (3,532 records) and falls away after 1972; 57.6% of all records belong to 1968-71.</w:t>
+      </w:r>
+    </w:p>
+    <w:p>
+      <w:pPr>
+        <w:spacing w:before="0" w:after="60"/>
+        <w:ind w:left="425" w:hanging="312"/>
+        <w:jc w:val="both"/>
+      </w:pPr>
+      <w:r>
+        <w:rPr>
+          <w:rFonts w:ascii="Times New Roman" w:hAnsi="Times New Roman"/>
+          <w:b w:val="0"/>
+          <w:i w:val="0"/>
+          <w:color w:val="000000"/>
+          <w:sz w:val="24"/>
+        </w:rPr>
+        <w:t>•  Most deliveries go to South Vietnam (53.5% of records), then Laos (29.2%), North Vietnam (12.0%) and Cambodia (4.9%).</w:t>
+      </w:r>
+    </w:p>
+    <w:p>
+      <w:pPr>
+        <w:spacing w:before="0" w:after="60"/>
+        <w:ind w:left="425" w:hanging="312"/>
+        <w:jc w:val="both"/>
+      </w:pPr>
+      <w:r>
+        <w:rPr>
+          <w:rFonts w:ascii="Times New Roman" w:hAnsi="Times New Roman"/>
+          <w:b w:val="0"/>
+          <w:i w:val="0"/>
+          <w:color w:val="000000"/>
+          <w:sz w:val="24"/>
+        </w:rPr>
+        <w:t>•  The F-4 is the most used aircraft (24.1%), followed by the F-100 (14.4%) and the A-1 (10.3%); bombs dominate what is delivered (61.8% of records with a known weapon class).</w:t>
+      </w:r>
+    </w:p>
+    <w:p>
+      <w:pPr>
+        <w:spacing w:before="0" w:after="60"/>
+        <w:ind w:left="425" w:hanging="312"/>
+        <w:jc w:val="both"/>
+      </w:pPr>
+      <w:r>
+        <w:rPr>
+          <w:rFonts w:ascii="Times New Roman" w:hAnsi="Times New Roman"/>
+          <w:b w:val="0"/>
+          <w:i w:val="0"/>
+          <w:color w:val="000000"/>
+          <w:sz w:val="24"/>
+        </w:rPr>
+        <w:t>•  Day records outnumber night records roughly 2.5 to 1 (13,786 against 5,380).</w:t>
+      </w:r>
+    </w:p>
+    <w:p>
+      <w:pPr>
+        <w:spacing w:before="0" w:after="60"/>
+        <w:ind w:left="425" w:hanging="312"/>
+        <w:jc w:val="both"/>
+      </w:pPr>
+      <w:r>
+        <w:rPr>
+          <w:rFonts w:ascii="Times New Roman" w:hAnsi="Times New Roman"/>
+          <w:b w:val="0"/>
+          <w:i w:val="0"/>
+          <w:color w:val="000000"/>
+          <w:sz w:val="24"/>
+        </w:rPr>
+        <w:t>•  Every numerical variable is heavily right-skewed (weapons: mean 38.1 against median 8), so medians and quartiles describe the typical record, not means.</w:t>
       </w:r>
     </w:p>
     <w:p>
@@ -10908,7 +10977,7 @@
           <w:color w:val="000000"/>
           <w:sz w:val="24"/>
         </w:rPr>
-        <w:t>The weapon load (LOAD_LB) is recorded for the 5,894 sampled records of the SEADAB source (29.5% of the sample) and is the best continuous measure of the size of a delivery in the data. A probability model for it allows statements such as 'the chance that a record delivers more than 50,000 lb' to be computed. The approach is: estimate the parameters of the candidate models by maximum likelihood, test the goodness of fit with the chi-square test on equal-probability bins, and verify the central limit theorem by simulation.</w:t>
+        <w:t>The weapon load (LOAD_LB) is the best continuous measure of how big a single delivery was. It is available for the 5,894 sampled records that come from the SEADAB source (29.5% of the sample). A probability model for this variable lets us answer questions like 'how likely is a delivery above 50,000 lb?'. The plan: estimate the parameters of two candidate models (normal and lognormal) by maximum likelihood, test each fit with a chi-square goodness-of-fit test, and then verify the central limit theorem with a simulation.</w:t>
       </w:r>
     </w:p>
     <w:p>
@@ -10940,7 +11009,7 @@
           <w:color w:val="000000"/>
           <w:sz w:val="24"/>
         </w:rPr>
-        <w:t>1. Take the 5,894 records with a recorded load; summarise them (mean, median, standard deviation, skewness, kurtosis, quartiles).</w:t>
+        <w:t>1. Take the 5,894 records that have a load and summarise the variable (mean, median, sd, skewness, kurtosis, quartiles).</w:t>
       </w:r>
     </w:p>
     <w:p>
@@ -10957,7 +11026,7 @@
           <w:color w:val="000000"/>
           <w:sz w:val="24"/>
         </w:rPr>
-        <w:t>2. Fit the normal model: parameters equal to the sample mean and standard deviation (maximum likelihood for the normal).</w:t>
+        <w:t>2. Fit a normal model, using the sample mean and sd as the maximum-likelihood estimates.</w:t>
       </w:r>
     </w:p>
     <w:p>
@@ -10974,7 +11043,7 @@
           <w:color w:val="000000"/>
           <w:sz w:val="24"/>
         </w:rPr>
-        <w:t>3. Fit the lognormal model: take log10(load), fit a normal distribution to the logs, report the parameters in natural log units.</w:t>
+        <w:t>3. Fit a lognormal model: take log10(load), fit a normal distribution to the logs, and report the parameters in natural log units.</w:t>
       </w:r>
     </w:p>
     <w:p>
@@ -10991,7 +11060,7 @@
           <w:color w:val="000000"/>
           <w:sz w:val="24"/>
         </w:rPr>
-        <w:t>4. Chi-square goodness of fit for both models: split the fitted distribution into 8 equally likely bins, count the observed records in the same bins, compute the chi-square statistic with df = 7 - 2 estimated parameters = 5.</w:t>
+        <w:t>4. Test both fits with the chi-square goodness-of-fit test on 8 equally likely bins (df = 7 - 2 estimated parameters = 5).</w:t>
       </w:r>
     </w:p>
     <w:p>
@@ -11008,7 +11077,7 @@
           <w:color w:val="000000"/>
           <w:sz w:val="24"/>
         </w:rPr>
-        <w:t>5. Compare observed and fitted quartiles and compute model probabilities; use boxplots of the load by aircraft group to investigate the misfit.</w:t>
+        <w:t>5. Compare observed and fitted quartiles and probabilities, and use boxplots by aircraft group to see why any misfit happens.</w:t>
       </w:r>
     </w:p>
     <w:p>
@@ -11025,7 +11094,7 @@
           <w:color w:val="000000"/>
           <w:sz w:val="24"/>
         </w:rPr>
-        <w:t>6. Central limit theorem: draw 20,000 samples of n = 30 records, form the sample means, compare their mean, standard deviation and shape with the theoretical values, and compute the probability that the sample mean exceeds 70,000 lb by theory and by simulation.</w:t>
+        <w:t>6. Central limit theorem: 20,000 simulated samples of 30 records; compare the mean, sd and skewness of the sample means with theory, and compute the probability that the sample mean exceeds 70,000 lb both ways.</w:t>
       </w:r>
     </w:p>
     <w:p>
@@ -11569,7 +11638,7 @@
           <w:color w:val="000000"/>
           <w:sz w:val="24"/>
         </w:rPr>
-        <w:t>Normal model: mean 59,795.3 lb, sd 94,703.2 lb. The chi-square statistic is 7,337.8 on 5 degrees of freedom (p &lt; 2.2e-16), i.e. the model is rejected. The fitted normal puts 12.5% of the records in the lowest bin, but not a single record can be below the physical minimum of zero, so the lower tail is impossible.</w:t>
+        <w:t>Normal model: the fitted parameters are mean 59,795.3 lb and sd 94,703.2 lb, and the chi-square statistic is 7,337.8 on 5 degrees of freedom (p &lt; 2.2e-16) - a clear rejection. One number shows why: the normal model wants 12.5% of the records in the lowest bin, but no delivery load can be negative, so the model's lower tail is impossible.</w:t>
       </w:r>
     </w:p>
     <w:p>
@@ -11697,7 +11766,7 @@
           <w:color w:val="000000"/>
           <w:sz w:val="24"/>
         </w:rPr>
-        <w:t>Lognormal model: log10(load) has mean 4.4669 and sd 0.5616, i.e. meanlog = 10.2854 and sdlog = 1.2931 in natural logs. The goodness-of-fit chi-square statistic is 610.2 on 5 degrees of freedom (p &lt; 2.2e-16): the lognormal model is far better than the normal (statistic 610 vs 7,338) but is still formally rejected, because the sample is large and the observed bin counts are not smooth (727, 582, 550, 653, 1,163, 1,006, 825, 388 against 736.8 expected in each bin). The middle bins contain more records and the tails fewer than the model predicts; the fitted quartiles (12,249 / 29,302 / 70,097) differ from the observed ones (15,930 / 34,260 / 63,720) in both tails.</w:t>
+        <w:t>The lognormal model does much better. On the log scale the sample has mean 4.4669 and sd 0.5616 (meanlog 10.2854 and sdlog 1.2931 in natural logs). The chi-square statistic drops from 7,338 to 610.2 - still df = 5, and still a formal rejection (p &lt; 2.2e-16), because with n = 5,894 even small imperfections are detectable. The bin counts show the pattern: the middle bins hold more records than expected (1,163 and 1,006 against 736.8 each) and the tails fewer. The quartiles tell the same story: fitted 12,249 / 29,302 / 70,097 against observed 15,930 / 34,260 / 63,720.</w:t>
       </w:r>
     </w:p>
     <w:tbl>
@@ -12127,7 +12196,7 @@
           <w:color w:val="000000"/>
           <w:sz w:val="24"/>
         </w:rPr>
-        <w:t>Inference: the load distribution is a mixture of very different aircraft groups, not one single population. A single lognormal cannot fit a mixture, which explains the formal rejection even though the lognormal is qualitatively the right family. This is a limitation of the source data (the load is only recorded for one source database) rather than a failure of the method.</w:t>
+        <w:t>Figure 2.4 explains the rejection: the load is not one population but a mixture of aircraft groups. A B-52 record carries a median of 3,82,320 lb - more than ten times the A-37 median (21,240 lb) and eight times the F-4 median (47,790 lb). No single distribution can fit a mixture this wide. This is a property of the data (very different aircraft pooled together, load recorded in one source only), not a failure of the method.</w:t>
       </w:r>
     </w:p>
     <w:p>
@@ -12199,7 +12268,7 @@
           <w:color w:val="000000"/>
           <w:sz w:val="24"/>
         </w:rPr>
-        <w:t>Central limit theorem: for n = 30 the standard error of the mean is 94,711.3 / sqrt(30) = 17,291.8 lb. The simulation gives mean 59,736.9 lb (theory 59,795.3) and standard deviation 17,169.1 lb (theory 17,291.8) - both match well. The theoretical normal probability P(sample mean &gt; 70,000) is 0.2775 while the simulation gives 0.2494; the distribution of the means is still slightly right-skewed (skewness 0.822), so n = 30 is not yet large for this very heavy-tailed variable.</w:t>
+        <w:t>For n = 30 the standard error of the mean is 94,711.3 / sqrt(30) = 17,291.8 lb. The simulation matches theory closely: the mean of the sample means is 59,736.9 lb (theory 59,795.3) and their sd is 17,169.1 lb (theory 17,291.8). The one visible imperfection is shape: the normal approximation gives P(sample mean &gt; 70,000) = 0.2775 while the simulation gives 0.2494, because with skewness 0.822 the distribution of the means is still slightly right-skewed at n = 30.</w:t>
       </w:r>
     </w:p>
     <w:p>
@@ -12219,7 +12288,8 @@
     </w:p>
     <w:p>
       <w:pPr>
-        <w:spacing w:before="0" w:after="200"/>
+        <w:spacing w:before="0" w:after="60"/>
+        <w:ind w:left="425" w:hanging="312"/>
         <w:jc w:val="both"/>
       </w:pPr>
       <w:r>
@@ -12230,7 +12300,58 @@
           <w:color w:val="000000"/>
           <w:sz w:val="24"/>
         </w:rPr>
-        <w:t>The normal model is clearly wrong for the weapon load (impossible negative region, statistic 7,338). The lognormal model captures the shape well on the log scale and gives useful probabilities (for example about 34% of the records exceed 50,000 lb against 35% observed), but it is formally rejected by the chi-square test (610.2, p &lt; 2.2e-16) because the data are a mixture of aircraft groups with very different loads. The central limit theorem was verified by simulation: the mean of 30 records has the theoretical mean and standard error, and the normal approximation for such means is adequate but not exact for this heavy-tailed variable.</w:t>
+        <w:t>•  The normal model is plainly wrong for the load - it needs negative loads and fits twelve times worse than the lognormal (chi-square 7,337.8 against 610.2).</w:t>
+      </w:r>
+    </w:p>
+    <w:p>
+      <w:pPr>
+        <w:spacing w:before="0" w:after="60"/>
+        <w:ind w:left="425" w:hanging="312"/>
+        <w:jc w:val="both"/>
+      </w:pPr>
+      <w:r>
+        <w:rPr>
+          <w:rFonts w:ascii="Times New Roman" w:hAnsi="Times New Roman"/>
+          <w:b w:val="0"/>
+          <w:i w:val="0"/>
+          <w:color w:val="000000"/>
+          <w:sz w:val="24"/>
+        </w:rPr>
+        <w:t>•  The lognormal captures the shape well and gives usable probabilities: about 34% of records above 50,000 lb against 35% observed, and all four thresholds in Table 8 within roughly 5 percentage points.</w:t>
+      </w:r>
+    </w:p>
+    <w:p>
+      <w:pPr>
+        <w:spacing w:before="0" w:after="60"/>
+        <w:ind w:left="425" w:hanging="312"/>
+        <w:jc w:val="both"/>
+      </w:pPr>
+      <w:r>
+        <w:rPr>
+          <w:rFonts w:ascii="Times New Roman" w:hAnsi="Times New Roman"/>
+          <w:b w:val="0"/>
+          <w:i w:val="0"/>
+          <w:color w:val="000000"/>
+          <w:sz w:val="24"/>
+        </w:rPr>
+        <w:t>•  It is still formally rejected (p &lt; 2.2e-16) because the data are a mixture of very different aircraft groups - a single distribution cannot fit all of them.</w:t>
+      </w:r>
+    </w:p>
+    <w:p>
+      <w:pPr>
+        <w:spacing w:before="0" w:after="60"/>
+        <w:ind w:left="425" w:hanging="312"/>
+        <w:jc w:val="both"/>
+      </w:pPr>
+      <w:r>
+        <w:rPr>
+          <w:rFonts w:ascii="Times New Roman" w:hAnsi="Times New Roman"/>
+          <w:b w:val="0"/>
+          <w:i w:val="0"/>
+          <w:color w:val="000000"/>
+          <w:sz w:val="24"/>
+        </w:rPr>
+        <w:t>•  The CLT check succeeded: the mean of 30 records matches theory in both mean and standard error (within about 1%), although the normal approximation is only approximate at n = 30 for such a heavy-tailed variable.</w:t>
       </w:r>
     </w:p>
     <w:p>
@@ -12312,7 +12433,7 @@
           <w:color w:val="000000"/>
           <w:sz w:val="24"/>
         </w:rPr>
-        <w:t>Period of day is one of the few operational factors that is recorded for almost every record (PERIOD missing for only 4.2%). If night deliveries carry systematically different loads, mission planning and the interpretation of the earlier descriptive graphs must take that into account. The two-sample t-test compares the mean load between the day and night groups; because the load is extremely skewed, the test is applied to log10(load), which turns the comparison into a comparison of geometric means. Welch's version of the test is used because it does not assume equal variances.</w:t>
+        <w:t>Period of day is one of the few operational factors that is recorded for almost every record (missing for just 4.2%). If day and night deliveries differ in size, that changes how the totals and graphs in this report should be read. Because the load is extremely skewed, the comparison is made on log10(load), which turns the t-test into a test of geometric means, and Welch's version is used so that unequal variances are handled properly.</w:t>
       </w:r>
     </w:p>
     <w:p>
@@ -13185,7 +13306,7 @@
     </w:p>
     <w:p>
       <w:pPr>
-        <w:spacing w:before="0" w:after="120"/>
+        <w:spacing w:before="0" w:after="40"/>
         <w:jc w:val="both"/>
       </w:pPr>
       <w:r>
@@ -13196,7 +13317,41 @@
           <w:color w:val="000000"/>
           <w:sz w:val="24"/>
         </w:rPr>
-        <w:t>Assumption checks: on the log scale the day group has skewness -0.79 and the night group -0.28 (against +4.55 for the raw load), so the log transformation makes the groups nearly symmetric; the Shapiro-Wilk test still rejects strict normality (day W = 0.9583, night W = 0.9876, both p &lt; 1e-10) as it does for almost any large sample. The variance ratio test (F = 0.605) and Levene's test (F = 143.1, p &lt; 2.2e-16) both indicate unequal variances, so Welch's version of the t-test is the correct one.</w:t>
+        <w:t>The checks before the test:</w:t>
+      </w:r>
+    </w:p>
+    <w:p>
+      <w:pPr>
+        <w:spacing w:before="0" w:after="60"/>
+        <w:ind w:left="425" w:hanging="312"/>
+        <w:jc w:val="both"/>
+      </w:pPr>
+      <w:r>
+        <w:rPr>
+          <w:rFonts w:ascii="Times New Roman" w:hAnsi="Times New Roman"/>
+          <w:b w:val="0"/>
+          <w:i w:val="0"/>
+          <w:color w:val="000000"/>
+          <w:sz w:val="24"/>
+        </w:rPr>
+        <w:t>•  Shape: on the log scale the groups are far better behaved (skewness -0.79 for day and -0.28 for night, against +4.55 for the raw load). Shapiro-Wilk still rejects strict normality (W = 0.9583 and 0.9876, both p &lt; 1e-10), as it does for almost any large sample, so the Mann-Whitney test is added as a safety net.</w:t>
+      </w:r>
+    </w:p>
+    <w:p>
+      <w:pPr>
+        <w:spacing w:before="0" w:after="60"/>
+        <w:ind w:left="425" w:hanging="312"/>
+        <w:jc w:val="both"/>
+      </w:pPr>
+      <w:r>
+        <w:rPr>
+          <w:rFonts w:ascii="Times New Roman" w:hAnsi="Times New Roman"/>
+          <w:b w:val="0"/>
+          <w:i w:val="0"/>
+          <w:color w:val="000000"/>
+          <w:sz w:val="24"/>
+        </w:rPr>
+        <w:t>•  Variances: both the F test (0.605) and Levene's test (F = 143.1, p &lt; 2.2e-16) say the variances differ, so Welch's t-test - which does not need equal variances - is the right choice.</w:t>
       </w:r>
     </w:p>
     <w:p>
@@ -13212,7 +13367,7 @@
           <w:color w:val="000000"/>
           <w:sz w:val="24"/>
         </w:rPr>
-        <w:t>Welch two-sample t-test result (on log10(load)): t = 8.069 on 2,561.6 degrees of freedom, p-value = 1.079e-15, so H0 is rejected. The mean log10(load) is 4.5086 for day and 4.3648 for night; the difference (day - night) is 0.1438 with 95% confidence interval [0.1088, 0.1787]. On the original scale this means the day geometric mean is 1.392 times the night geometric mean (39.2% higher), with interval [1.285, 1.509], i.e. between 28.5% and 50.9% higher. Cohen's d on the log scale is 0.258, a small to moderate effect.</w:t>
+        <w:t>Test result: t = 8.069 on 2,561.6 degrees of freedom, p = 1.079e-15, so the null hypothesis is rejected. The mean log10(load) is 4.5086 by day against 4.3648 at night; the difference (day - night) is 0.1438 with 95% confidence interval [0.1088, 0.1787]. Back on the original scale, the day geometric mean is 1.392 times the night value, about 39% higher, and the interval runs from 28.5% to 50.9%. Cohen's d is 0.258 - a small-to-moderate effect.</w:t>
       </w:r>
     </w:p>
     <w:p>
@@ -13228,7 +13383,7 @@
           <w:color w:val="000000"/>
           <w:sz w:val="24"/>
         </w:rPr>
-        <w:t>The raw group means tell the opposite story (night 65,258.9 lb against day 57,614.7 lb). The reason is visible in the data: night deliveries are polarised. 27.9% of night records deliver less than 10,000 lb (day: 13.8%) but 6.8% deliver more than 2,00,000 lb (day: 3.2%), so the night mean is pulled up by a small number of very heavy deliveries while the typical (median, geometric mean) night record is lighter. The median day load is 42,240 lb against 24,900 lb at night, a difference of 17,340 lb in the same direction as the t-test.</w:t>
+        <w:t>So why do the raw means say the opposite (night 65,258.9 lb against day 57,614.7 lb)? Because night deliveries are polarised: 27.9% of them are below 10,000 lb (day: 13.8%), but 6.8% are above 2,00,000 lb (day: 3.2%). A handful of very heavy night deliveries drags the mean up, while the median tells the honest story - 42,240 lb by day against 24,900 lb at night, a difference of 17,340 lb in the same direction as the t-test.</w:t>
       </w:r>
     </w:p>
     <w:p>
@@ -13244,7 +13399,7 @@
           <w:color w:val="000000"/>
           <w:sz w:val="24"/>
         </w:rPr>
-        <w:t>Mann-Whitney cross-check: U = 4,112,513, p &lt; 2.2e-16; the raw-load medians differ significantly in the same direction. The conclusion does not depend on the normality assumption.</w:t>
+        <w:t>The Mann-Whitney test agrees (U = 4,112,513, p &lt; 2.2e-16) on the raw loads, and it assumes neither normality nor equal variances - so the conclusion is not an artefact of the model assumptions.</w:t>
       </w:r>
     </w:p>
     <w:p>
@@ -13264,7 +13419,8 @@
     </w:p>
     <w:p>
       <w:pPr>
-        <w:spacing w:before="0" w:after="200"/>
+        <w:spacing w:before="0" w:after="60"/>
+        <w:ind w:left="425" w:hanging="312"/>
         <w:jc w:val="both"/>
       </w:pPr>
       <w:r>
@@ -13275,7 +13431,58 @@
           <w:color w:val="000000"/>
           <w:sz w:val="24"/>
         </w:rPr>
-        <w:t>There is strong evidence (p = 1.08e-15) that day and night deliveries differ: the typical day load is about 39% heavier than the typical night load (geometric means 32,254 lb against 23,165 lb; medians 42,240 lb against 24,900 lb). The effect is small to moderate (d = 0.26). The raw means disagree only because a few very heavy night deliveries (large formations) pull the night mean up - a textbook example of why skewed data should be compared on the log scale or with medians. Limitation: records of the same mission are not strictly independent, so the p-value is slightly optimistic; the effect size and the confidence interval remain the reliable quantities.</w:t>
+        <w:t>•  Day and night deliveries genuinely differ (Welch p = 1.08e-15): the typical day load is about 39% heavier (geometric means 32,254 against 23,165 lb; medians 42,240 against 24,900 lb).</w:t>
+      </w:r>
+    </w:p>
+    <w:p>
+      <w:pPr>
+        <w:spacing w:before="0" w:after="60"/>
+        <w:ind w:left="425" w:hanging="312"/>
+        <w:jc w:val="both"/>
+      </w:pPr>
+      <w:r>
+        <w:rPr>
+          <w:rFonts w:ascii="Times New Roman" w:hAnsi="Times New Roman"/>
+          <w:b w:val="0"/>
+          <w:i w:val="0"/>
+          <w:color w:val="000000"/>
+          <w:sz w:val="24"/>
+        </w:rPr>
+        <w:t>•  The effect is small to moderate (d = 0.26), and the non-parametric Mann-Whitney test agrees with the t-test.</w:t>
+      </w:r>
+    </w:p>
+    <w:p>
+      <w:pPr>
+        <w:spacing w:before="0" w:after="60"/>
+        <w:ind w:left="425" w:hanging="312"/>
+        <w:jc w:val="both"/>
+      </w:pPr>
+      <w:r>
+        <w:rPr>
+          <w:rFonts w:ascii="Times New Roman" w:hAnsi="Times New Roman"/>
+          <w:b w:val="0"/>
+          <w:i w:val="0"/>
+          <w:color w:val="000000"/>
+          <w:sz w:val="24"/>
+        </w:rPr>
+        <w:t>•  The raw means disagree only because a few very heavy night deliveries pull the night mean up - a textbook reminder to compare skewed data on the log scale or by medians.</w:t>
+      </w:r>
+    </w:p>
+    <w:p>
+      <w:pPr>
+        <w:spacing w:before="0" w:after="60"/>
+        <w:ind w:left="425" w:hanging="312"/>
+        <w:jc w:val="both"/>
+      </w:pPr>
+      <w:r>
+        <w:rPr>
+          <w:rFonts w:ascii="Times New Roman" w:hAnsi="Times New Roman"/>
+          <w:b w:val="0"/>
+          <w:i w:val="0"/>
+          <w:color w:val="000000"/>
+          <w:sz w:val="24"/>
+        </w:rPr>
+        <w:t>•  Limitation: one mission can produce several records, so the p-value is slightly optimistic; the effect size and the confidence interval are the quantities to trust.</w:t>
       </w:r>
     </w:p>
     <w:p>
@@ -14800,7 +15007,108 @@
           <w:color w:val="000000"/>
           <w:sz w:val="24"/>
         </w:rPr>
-        <w:t>Test result: chi-square = 4,538.3 on (7-1)(4-1) = 18 degrees of freedom, p &lt; 2.2e-16, so H0 is rejected: the aircraft mix depends on the target country. Cramer's V = 0.278, a moderate association.</w:t>
+        <w:t>Result: chi-square = 4,538.3 on (7-1)(4-1) = 18 degrees of freedom, p &lt; 2.2e-16 - independence is rejected. The aircraft mix clearly depends on where the mission went. Cramer's V = 0.278 says the link is moderate in strength.</w:t>
+      </w:r>
+    </w:p>
+    <w:p>
+      <w:pPr>
+        <w:spacing w:before="0" w:after="40"/>
+        <w:jc w:val="both"/>
+      </w:pPr>
+      <w:r>
+        <w:rPr>
+          <w:rFonts w:ascii="Times New Roman" w:hAnsi="Times New Roman"/>
+          <w:b w:val="0"/>
+          <w:i w:val="0"/>
+          <w:color w:val="000000"/>
+          <w:sz w:val="24"/>
+        </w:rPr>
+        <w:t>The residuals show exactly how the association works:</w:t>
+      </w:r>
+    </w:p>
+    <w:p>
+      <w:pPr>
+        <w:spacing w:before="0" w:after="60"/>
+        <w:ind w:left="425" w:hanging="312"/>
+        <w:jc w:val="both"/>
+      </w:pPr>
+      <w:r>
+        <w:rPr>
+          <w:rFonts w:ascii="Times New Roman" w:hAnsi="Times New Roman"/>
+          <w:b w:val="0"/>
+          <w:i w:val="0"/>
+          <w:color w:val="000000"/>
+          <w:sz w:val="24"/>
+        </w:rPr>
+        <w:t>•  F-100 and A-37: almost only South Vietnam (residuals +42.2 and +25.0; 90.8% and 85.4% of their records) - classic close air support.</w:t>
+      </w:r>
+    </w:p>
+    <w:p>
+      <w:pPr>
+        <w:spacing w:before="0" w:after="60"/>
+        <w:ind w:left="425" w:hanging="312"/>
+        <w:jc w:val="both"/>
+      </w:pPr>
+      <w:r>
+        <w:rPr>
+          <w:rFonts w:ascii="Times New Roman" w:hAnsi="Times New Roman"/>
+          <w:b w:val="0"/>
+          <w:i w:val="0"/>
+          <w:color w:val="000000"/>
+          <w:sz w:val="24"/>
+        </w:rPr>
+        <w:t>•  A-4 Skyhawk (US Navy): over-represented over North Vietnam (+24.0; 29.4% of its records against 12.1% of the sample).</w:t>
+      </w:r>
+    </w:p>
+    <w:p>
+      <w:pPr>
+        <w:spacing w:before="0" w:after="60"/>
+        <w:ind w:left="425" w:hanging="312"/>
+        <w:jc w:val="both"/>
+      </w:pPr>
+      <w:r>
+        <w:rPr>
+          <w:rFonts w:ascii="Times New Roman" w:hAnsi="Times New Roman"/>
+          <w:b w:val="0"/>
+          <w:i w:val="0"/>
+          <w:color w:val="000000"/>
+          <w:sz w:val="24"/>
+        </w:rPr>
+        <w:t>•  F-4 Phantom: over Laos (+25.4; 43.9% of its records) and under over South Vietnam (-27.3).</w:t>
+      </w:r>
+    </w:p>
+    <w:p>
+      <w:pPr>
+        <w:spacing w:before="0" w:after="60"/>
+        <w:ind w:left="425" w:hanging="312"/>
+        <w:jc w:val="both"/>
+      </w:pPr>
+      <w:r>
+        <w:rPr>
+          <w:rFonts w:ascii="Times New Roman" w:hAnsi="Times New Roman"/>
+          <w:b w:val="0"/>
+          <w:i w:val="0"/>
+          <w:color w:val="000000"/>
+          <w:sz w:val="24"/>
+        </w:rPr>
+        <w:t>•  B-52: over Cambodia (+14.3; 15.3% of its records against 4.9%) - the well-known pattern of the Cambodian bombing.</w:t>
+      </w:r>
+    </w:p>
+    <w:p>
+      <w:pPr>
+        <w:spacing w:before="0" w:after="60"/>
+        <w:ind w:left="425" w:hanging="312"/>
+        <w:jc w:val="both"/>
+      </w:pPr>
+      <w:r>
+        <w:rPr>
+          <w:rFonts w:ascii="Times New Roman" w:hAnsi="Times New Roman"/>
+          <w:b w:val="0"/>
+          <w:i w:val="0"/>
+          <w:color w:val="000000"/>
+          <w:sz w:val="24"/>
+        </w:rPr>
+        <w:t>•  F-100: almost never over North Vietnam (-20.5).</w:t>
       </w:r>
     </w:p>
     <w:p>
@@ -14816,7 +15124,7 @@
           <w:color w:val="000000"/>
           <w:sz w:val="24"/>
         </w:rPr>
-        <w:t>The largest standardised residuals identify how the association works: the F-100 and the A-37 operate almost only over South Vietnam (residuals +42.2 and +25.0; 90.8% and 85.4% of their records). The A-4 Skyhawk (a US Navy aircraft) is over represented over North Vietnam (+24.0; 29.4% of its records against 12.1% of the sample) and the F-4 Phantom is over represented over Laos (+25.4; 43.9%). The B-52 is over represented over Cambodia (+14.3; 15.3% of its records against 4.9%) - the well-known pattern of the secret Cambodian bombing. The F-4 is less used over South Vietnam than expected (-27.3) and the F-100 almost never over North Vietnam (-20.5). The overall conclusion is that the aircraft-country combination is a fairly strong role effect: each aircraft family has a characteristic theatre.</w:t>
+        <w:t>In short, each aircraft family has its own operational home.</w:t>
       </w:r>
     </w:p>
     <w:p>
@@ -14836,7 +15144,8 @@
     </w:p>
     <w:p>
       <w:pPr>
-        <w:spacing w:before="0" w:after="200"/>
+        <w:spacing w:before="0" w:after="60"/>
+        <w:ind w:left="425" w:hanging="312"/>
         <w:jc w:val="both"/>
       </w:pPr>
       <w:r>
@@ -14847,7 +15156,41 @@
           <w:color w:val="000000"/>
           <w:sz w:val="24"/>
         </w:rPr>
-        <w:t>Aircraft type and target country are not independent (chi-square = 4,538.3, df = 18, p &lt; 2.2e-16, Cramer's V = 0.278). Interpreting the residuals: fighter-bombers like the F-100 and A-37 fly close air support over South Vietnam, the F-4 covers Laos and the North, the carrier-based A-4 concentrates on North Vietnam, and the B-52 is heavily over represented over Cambodia. Note the limitation: records are not strictly independent (several per mission) and the Thailand cells had to be excluded to keep the chi-square approximation valid, so the p-value is optimistic; the effect size (moderate) and the residual pattern are the robust results.</w:t>
+        <w:t>•  Aircraft type and target country are not independent (chi-square = 4,538.3, df = 18, p &lt; 2.2e-16); the association is moderate (Cramer's V = 0.278).</w:t>
+      </w:r>
+    </w:p>
+    <w:p>
+      <w:pPr>
+        <w:spacing w:before="0" w:after="60"/>
+        <w:ind w:left="425" w:hanging="312"/>
+        <w:jc w:val="both"/>
+      </w:pPr>
+      <w:r>
+        <w:rPr>
+          <w:rFonts w:ascii="Times New Roman" w:hAnsi="Times New Roman"/>
+          <w:b w:val="0"/>
+          <w:i w:val="0"/>
+          <w:color w:val="000000"/>
+          <w:sz w:val="24"/>
+        </w:rPr>
+        <w:t>•  The residuals read like the history of the air war: the F-100 and A-37 cover the South, the Navy's A-4 concentrates on the North, the F-4 works over Laos, and the B-52 concentrates on Cambodia.</w:t>
+      </w:r>
+    </w:p>
+    <w:p>
+      <w:pPr>
+        <w:spacing w:before="0" w:after="60"/>
+        <w:ind w:left="425" w:hanging="312"/>
+        <w:jc w:val="both"/>
+      </w:pPr>
+      <w:r>
+        <w:rPr>
+          <w:rFonts w:ascii="Times New Roman" w:hAnsi="Times New Roman"/>
+          <w:b w:val="0"/>
+          <w:i w:val="0"/>
+          <w:color w:val="000000"/>
+          <w:sz w:val="24"/>
+        </w:rPr>
+        <w:t>•  Caveats: the 82 Thailand records were excluded (two expected counts below 5), and mission-level dependence makes the p-value optimistic - the residual pattern and Cramer's V are the robust results.</w:t>
       </w:r>
     </w:p>
     <w:p>
@@ -14929,7 +15272,7 @@
           <w:color w:val="000000"/>
           <w:sz w:val="24"/>
         </w:rPr>
-        <w:t>The number of aircraft in a record measures the size of the formation that flew the delivery. The purpose is to quantify how much of the size of a formation is explained by the factors recorded in the data, which combination of factors produces the largest formations, and whether the model can be used for prediction. The analysis has two stages: correlation analysis of the numerical variables (Spearman coefficients are the reliable ones because of the skew), and a multiple linear regression of log10(AIRCRAFT_NO) on the five categorical/numerical factors, with full diagnostics.</w:t>
+        <w:t>The number of aircraft in a record is a direct measure of how big the formation was. This analysis asks three questions: which variables move together (correlation analysis), how much of the formation size the recorded factors explain (multiple regression), and whether the model predicts sensibly for a given mission profile. Because the count is heavily skewed, the regression works on log10(aircraft) and the correlations are read mainly from the Spearman coefficients.</w:t>
       </w:r>
     </w:p>
     <w:p>
@@ -15077,7 +15420,7 @@
           <w:color w:val="000000"/>
           <w:sz w:val="24"/>
         </w:rPr>
-        <w:t>Correlation analysis (Spearman coefficients, all p &lt; 2.2e-16 unless stated): the strongest association is between weapons delivered and weapon load (rho = 0.648); aircraft per record correlate with the load (0.288) and with weapons delivered (0.173); the hour at target has a weak negative association with aircraft (-0.217); latitude and longitude are negatively correlated (-0.280) simply because the theatre runs from north-west to south-east. The Pearson coefficients are much smaller for the heavy-tailed pairs (for example 0.247 against 0.173 for aircraft and weapons), confirming that the skew distorts the linear correlation.</w:t>
+        <w:t>Correlations first (Spearman values; all p &lt; 2.2e-16 unless stated). The strongest pair is weapons delivered and load (rho = 0.648) - heavier loads mean more bombs. Aircraft per record moves with the load (0.288) and with weapons delivered (0.173), and slightly against the hour at target (-0.217). Latitude and longitude correlate negatively (-0.280) simply because the theatre runs from north-west to south-east. Notice how much smaller the Pearson values are for the skewed pairs (0.247 against 0.173 for aircraft and weapons): linear correlation on skewed data understates the relationship.</w:t>
       </w:r>
     </w:p>
     <w:p>
@@ -15626,7 +15969,7 @@
           <w:color w:val="000000"/>
           <w:sz w:val="24"/>
         </w:rPr>
-        <w:t>Multiple regression result: R squared = 0.166 (adjusted 0.1654), so the five factors together explain about 17% of the variation of log10(aircraft) between records; the overall F test is 267.2 on (14, 18,796) degrees of freedom, p &lt; 2.2e-16. The largest effects on the size of a formation, holding the other factors constant:</w:t>
+        <w:t>Multiple regression: R squared = 0.166 (adjusted 0.1654), with F = 267.2 on (14, 18,796) degrees of freedom, p &lt; 2.2e-16. In words: type, country, period, year and source together explain about 17% of why one record has more aircraft than another. The biggest effects, holding the other factors fixed:</w:t>
       </w:r>
     </w:p>
     <w:tbl>
@@ -16358,7 +16701,7 @@
           <w:color w:val="000000"/>
           <w:sz w:val="24"/>
         </w:rPr>
-        <w:t>Interpretation: B-52 records involve about 1.56 times as many aircraft as the equivalent F-4 records - the classic multi-aircraft cell formations. Night records are about 37% smaller than day records of the same type and country, and the two smaller source databases (CACTA) record formations about 35% and 21% smaller than SEADAB, which is consistent with them recording different kinds of missions. Formations shrink by about 7% per war year, and attacks recorded over Cambodia are about 18% smaller than over South Vietnam.</w:t>
+        <w:t>In plain language: a B-52 record carries about 1.56 times the aircraft of an equivalent F-4 record (the big multi-aircraft cells); night operations are about 37% smaller; the two smaller CACTA sources record formations 35% and 21% smaller than SEADAB, which fits with them capturing different kinds of missions; formation sizes shrink by about 7% for each year of the war; and records over Cambodia are about 18% smaller than over South Vietnam.</w:t>
       </w:r>
     </w:p>
     <w:p>
@@ -16475,7 +16818,7 @@
     </w:p>
     <w:p>
       <w:pPr>
-        <w:spacing w:before="0" w:after="120"/>
+        <w:spacing w:before="0" w:after="40"/>
         <w:jc w:val="both"/>
       </w:pPr>
       <w:r>
@@ -16486,7 +16829,58 @@
           <w:color w:val="000000"/>
           <w:sz w:val="24"/>
         </w:rPr>
-        <w:t>Model checks: the residuals have mean zero by construction; skewness 2.45 and kurtosis 11.4 (Shapiro-Wilk W = 0.822 on a subsample of 2,000, p &lt; 2.2e-16), driven by the right tail of very large formations, not by an error of specification. No observation is influential: the largest Cook's distance is 0.0089, far below 1, and only 2.81% of the records exceed the 4/n guideline. Collinearity is moderate: the variance inflation of YEAR against all other predictors is 3.76, below the usual threshold of 5, but part of the year trend overlaps with the country mix (for example Thailand targets appear only late in the war), so the year coefficient should be read as an average trend, not as a causal effect.</w:t>
+        <w:t>The diagnostic checks hold up:</w:t>
+      </w:r>
+    </w:p>
+    <w:p>
+      <w:pPr>
+        <w:spacing w:before="0" w:after="60"/>
+        <w:ind w:left="425" w:hanging="312"/>
+        <w:jc w:val="both"/>
+      </w:pPr>
+      <w:r>
+        <w:rPr>
+          <w:rFonts w:ascii="Times New Roman" w:hAnsi="Times New Roman"/>
+          <w:b w:val="0"/>
+          <w:i w:val="0"/>
+          <w:color w:val="000000"/>
+          <w:sz w:val="24"/>
+        </w:rPr>
+        <w:t>•  Residuals: mean zero by construction, but skewness 2.45 and kurtosis 11.4 (Shapiro-Wilk W = 0.822 on a subsample of 2,000, p &lt; 2.2e-16). The cause is the right tail - a few giant formations (up to 99 aircraft) that any multiplicative model under-predicts; the middle of the distribution is well behaved.</w:t>
+      </w:r>
+    </w:p>
+    <w:p>
+      <w:pPr>
+        <w:spacing w:before="0" w:after="60"/>
+        <w:ind w:left="425" w:hanging="312"/>
+        <w:jc w:val="both"/>
+      </w:pPr>
+      <w:r>
+        <w:rPr>
+          <w:rFonts w:ascii="Times New Roman" w:hAnsi="Times New Roman"/>
+          <w:b w:val="0"/>
+          <w:i w:val="0"/>
+          <w:color w:val="000000"/>
+          <w:sz w:val="24"/>
+        </w:rPr>
+        <w:t>•  Influence: the largest Cook's distance is 0.0089, far below 1, and only 2.81% of records pass the 4/n guideline - no single record is driving the fit.</w:t>
+      </w:r>
+    </w:p>
+    <w:p>
+      <w:pPr>
+        <w:spacing w:before="0" w:after="60"/>
+        <w:ind w:left="425" w:hanging="312"/>
+        <w:jc w:val="both"/>
+      </w:pPr>
+      <w:r>
+        <w:rPr>
+          <w:rFonts w:ascii="Times New Roman" w:hAnsi="Times New Roman"/>
+          <w:b w:val="0"/>
+          <w:i w:val="0"/>
+          <w:color w:val="000000"/>
+          <w:sz w:val="24"/>
+        </w:rPr>
+        <w:t>•  Collinearity: the VIF of YEAR is 3.76 - below the usual threshold of 5, but not 1, because the country mix drifts over the war (Thailand appears only late). Read the year effect as an average trend, not a causal effect.</w:t>
       </w:r>
     </w:p>
     <w:p>
@@ -16502,7 +16896,7 @@
           <w:color w:val="000000"/>
           <w:sz w:val="24"/>
         </w:rPr>
-        <w:t>Prediction example: for the profile 'F-4 Phantom, target North Vietnam, night, 1972, SEADAB' the model predicts 1.55 aircraft with a 95% prediction interval of [0.51, 4.69]. The 32 observed records with exactly this profile have a mean of 1.75 aircraft, comfortably inside the interval. The interval is wide on the original scale (a factor of nine) - honest evidence that the model predicts the average behaviour of a group of records well, but a single record only roughly.</w:t>
+        <w:t>Prediction test: for the profile 'F-4 Phantom, target North Vietnam, night, 1972, SEADAB' the model predicts 1.55 aircraft with a 95% prediction interval of [0.51, 4.69]. The 32 real records matching this profile average 1.75 aircraft - right inside the interval. The interval is wide on the original scale (a factor of about nine), which is honest: the model describes group averages well, a single record only roughly.</w:t>
       </w:r>
     </w:p>
     <w:p>
@@ -16522,7 +16916,8 @@
     </w:p>
     <w:p>
       <w:pPr>
-        <w:spacing w:before="0" w:after="200"/>
+        <w:spacing w:before="0" w:after="60"/>
+        <w:ind w:left="425" w:hanging="312"/>
         <w:jc w:val="both"/>
       </w:pPr>
       <w:r>
@@ -16533,7 +16928,58 @@
           <w:color w:val="000000"/>
           <w:sz w:val="24"/>
         </w:rPr>
-        <w:t>The size of a formation is dominated by the aircraft type (B-52 cells carry about 56% more aircraft than the F-4 reference) and by the period of day (night records are about 37% smaller). The five factors together explain about 17% of the record-to-record variation, which is realistic: many determinants of a formation (target importance, availability, weather, operation) are not in the data. The model passes the practical checks (no influential observations, moderate collinearity, sensible residuals) and its prediction interval covers the observed mean of a specific mission profile. Correlation results confirm the relationships and warn that Pearson coefficients on skewed variables understate the association (weapons-load: Pearson 0.31 against Spearman 0.65).</w:t>
+        <w:t>•  Formation size is dominated by aircraft type and period of day: B-52 records carry about 56% more aircraft than equivalent F-4 records, and night records about 37% fewer.</w:t>
+      </w:r>
+    </w:p>
+    <w:p>
+      <w:pPr>
+        <w:spacing w:before="0" w:after="60"/>
+        <w:ind w:left="425" w:hanging="312"/>
+        <w:jc w:val="both"/>
+      </w:pPr>
+      <w:r>
+        <w:rPr>
+          <w:rFonts w:ascii="Times New Roman" w:hAnsi="Times New Roman"/>
+          <w:b w:val="0"/>
+          <w:i w:val="0"/>
+          <w:color w:val="000000"/>
+          <w:sz w:val="24"/>
+        </w:rPr>
+        <w:t>•  The five recorded factors explain about 17% of the record-to-record variation - realistic, since target importance, aircraft availability and weather are not in the data.</w:t>
+      </w:r>
+    </w:p>
+    <w:p>
+      <w:pPr>
+        <w:spacing w:before="0" w:after="60"/>
+        <w:ind w:left="425" w:hanging="312"/>
+        <w:jc w:val="both"/>
+      </w:pPr>
+      <w:r>
+        <w:rPr>
+          <w:rFonts w:ascii="Times New Roman" w:hAnsi="Times New Roman"/>
+          <w:b w:val="0"/>
+          <w:i w:val="0"/>
+          <w:color w:val="000000"/>
+          <w:sz w:val="24"/>
+        </w:rPr>
+        <w:t>•  All practical checks pass: no influential records, moderate collinearity, sensible residuals, and the prediction interval covers the observed mean of a real mission profile.</w:t>
+      </w:r>
+    </w:p>
+    <w:p>
+      <w:pPr>
+        <w:spacing w:before="0" w:after="60"/>
+        <w:ind w:left="425" w:hanging="312"/>
+        <w:jc w:val="both"/>
+      </w:pPr>
+      <w:r>
+        <w:rPr>
+          <w:rFonts w:ascii="Times New Roman" w:hAnsi="Times New Roman"/>
+          <w:b w:val="0"/>
+          <w:i w:val="0"/>
+          <w:color w:val="000000"/>
+          <w:sz w:val="24"/>
+        </w:rPr>
+        <w:t>•  The correlation analysis adds a caution: on data this skewed, Pearson coefficients understate the links (weapons against load: 0.31, against the Spearman 0.65).</w:t>
       </w:r>
     </w:p>
     <w:p>
@@ -16558,7 +17004,8 @@
     </w:p>
     <w:p>
       <w:pPr>
-        <w:spacing w:before="0" w:after="80"/>
+        <w:spacing w:before="0" w:after="60"/>
+        <w:ind w:left="425" w:hanging="312"/>
         <w:jc w:val="both"/>
       </w:pPr>
       <w:r>
@@ -16569,12 +17016,13 @@
           <w:color w:val="000000"/>
           <w:sz w:val="24"/>
         </w:rPr>
-        <w:t>1. The data preparation pipeline (chunked reading of the 46-lakh-record file, weapon-delivery population definition, random sample of 20,000 records, cleaning with documented rules) produced a reproducible analysis file; every number in this report is regenerated by one command per script and logged in outputs/.</w:t>
+        <w:t>•  Data: 46.7 lakh raw records reduced to a documented, reproducible 20,000-record random sample; every number in this report is regenerated by the scripts and logged in outputs/.</w:t>
       </w:r>
     </w:p>
     <w:p>
       <w:pPr>
-        <w:spacing w:before="0" w:after="80"/>
+        <w:spacing w:before="0" w:after="60"/>
+        <w:ind w:left="425" w:hanging="312"/>
         <w:jc w:val="both"/>
       </w:pPr>
       <w:r>
@@ -16585,12 +17033,13 @@
           <w:color w:val="000000"/>
           <w:sz w:val="24"/>
         </w:rPr>
-        <w:t>2. Problem 1: the recorded campaign peaks in 1970, concentrates on South Vietnam and Laos, is flown mainly by F-4, F-100, A-1, A-4 and A-37 aircraft and delivers mostly bombs; every numerical variable is strongly right-skewed, so the typical record is described by medians and quartiles rather than means.</w:t>
+        <w:t>•  Problem 1 - the campaign peaks in 1970, concentrates on South Vietnam and Laos, is flown mainly by the F-4, F-100 and A-1, and delivers mostly bombs.</w:t>
       </w:r>
     </w:p>
     <w:p>
       <w:pPr>
-        <w:spacing w:before="0" w:after="80"/>
+        <w:spacing w:before="0" w:after="60"/>
+        <w:ind w:left="425" w:hanging="312"/>
         <w:jc w:val="both"/>
       </w:pPr>
       <w:r>
@@ -16601,12 +17050,13 @@
           <w:color w:val="000000"/>
           <w:sz w:val="24"/>
         </w:rPr>
-        <w:t>3. Problem 2: the weapon load is lognormal in shape (far better than the normal model) but the fit is formally rejected because the load is a mixture of very different aircraft groups (B-52 median 3.82 lakh lb against A-37 21,240 lb); model-based probabilities are still accurate to within about 4 percentage points; the central limit theorem check for the mean of 30 records matched theory in mean and standard error.</w:t>
+        <w:t>•  Problem 2 - the weapon load follows a lognormal shape (far better than the normal), but the fit is formally rejected because the load is a mixture of aircraft types; model probabilities stay within about 5 percentage points, and the CLT check passed.</w:t>
       </w:r>
     </w:p>
     <w:p>
       <w:pPr>
-        <w:spacing w:before="0" w:after="80"/>
+        <w:spacing w:before="0" w:after="60"/>
+        <w:ind w:left="425" w:hanging="312"/>
         <w:jc w:val="both"/>
       </w:pPr>
       <w:r>
@@ -16617,12 +17067,13 @@
           <w:color w:val="000000"/>
           <w:sz w:val="24"/>
         </w:rPr>
-        <w:t>4. Problem 3: day deliveries carry about 39% more load than night deliveries (geometric means; medians 42,240 against 24,900 lb; Welch p = 1.08e-15, d = 0.26) - the raw means mislead because a few very heavy night formations pull the night mean up.</w:t>
+        <w:t>•  Problem 3 - day deliveries are about 39% heavier than night deliveries in typical value (medians 42,240 against 24,900 lb), with a small-to-moderate effect size.</w:t>
       </w:r>
     </w:p>
     <w:p>
       <w:pPr>
-        <w:spacing w:before="0" w:after="80"/>
+        <w:spacing w:before="0" w:after="60"/>
+        <w:ind w:left="425" w:hanging="312"/>
         <w:jc w:val="both"/>
       </w:pPr>
       <w:r>
@@ -16633,12 +17084,13 @@
           <w:color w:val="000000"/>
           <w:sz w:val="24"/>
         </w:rPr>
-        <w:t>5. Problem 4: the aircraft mix is not independent of the target country (chi-square = 4,538.3, df = 18, p &lt; 2.2e-16, Cramer's V = 0.278); the standardised residuals show exactly how each aircraft family is tied to a theatre.</w:t>
+        <w:t>•  Problem 4 - the aircraft mix depends strongly on the target country (chi-square = 4,538.3, V = 0.278): each aircraft family has its own theatre.</w:t>
       </w:r>
     </w:p>
     <w:p>
       <w:pPr>
-        <w:spacing w:before="0" w:after="80"/>
+        <w:spacing w:before="0" w:after="60"/>
+        <w:ind w:left="425" w:hanging="312"/>
         <w:jc w:val="both"/>
       </w:pPr>
       <w:r>
@@ -16649,12 +17101,13 @@
           <w:color w:val="000000"/>
           <w:sz w:val="24"/>
         </w:rPr>
-        <w:t>6. Problem 5: log10 of the aircraft per record is explained by type, period, country, year and source (R squared = 0.166, F = 267.2); B-52 records carry about 1.56 times the aircraft of an F-4 record and night records about 37% fewer; the prediction example validated against the observed records.</w:t>
+        <w:t>•  Problem 5 - formation size is explained by type, period, country, year and source (R squared = 0.166); B-52 records carry about 1.56 times the aircraft of an F-4 record, night records about 37% fewer - and the prediction test passed.</w:t>
       </w:r>
     </w:p>
     <w:p>
       <w:pPr>
-        <w:spacing w:before="0" w:after="80"/>
+        <w:spacing w:before="0" w:after="60"/>
+        <w:ind w:left="425" w:hanging="312"/>
         <w:jc w:val="both"/>
       </w:pPr>
       <w:r>
@@ -16665,12 +17118,13 @@
           <w:color w:val="000000"/>
           <w:sz w:val="24"/>
         </w:rPr>
-        <w:t>7. Across the five problems one methodological lesson repeats: the recorded quantities (weapons, load) are extremely right-skewed, so medians, geometric means and log-scale tests describe the data honestly, while raw means are distorted by a small number of very large deliveries.</w:t>
+        <w:t>•  One lesson repeats in all five problems: these data are heavily right-skewed, so medians, geometric means and log-scale tests tell the honest story - raw means can even flip the conclusion.</w:t>
       </w:r>
     </w:p>
     <w:p>
       <w:pPr>
-        <w:spacing w:before="0" w:after="80"/>
+        <w:spacing w:before="0" w:after="60"/>
+        <w:ind w:left="425" w:hanging="312"/>
         <w:jc w:val="both"/>
       </w:pPr>
       <w:r>
@@ -16681,7 +17135,7 @@
           <w:color w:val="000000"/>
           <w:sz w:val="24"/>
         </w:rPr>
-        <w:t>8. Main limitations, stated consistently: records are delivery events (not independent missions), the load is recorded only in SEADAB, several raw columns are unusable (WEAPONTYPECLASS 100% empty, BDA 94% empty), and the source file mixes four databases without de-duplication flags.</w:t>
+        <w:t>•  Same caveats throughout: records are delivery events, not independent missions; the load is recorded only in SEADAB; several raw columns are unusable.</w:t>
       </w:r>
     </w:p>
     <w:p>

</xml_diff>

<commit_message>
Report: student names on cover, bullet software section, humanized front matter
</commit_message>
<xml_diff>
--- a/report/report.docx
+++ b/report/report.docx
@@ -271,6 +271,7 @@
                 <w:color w:val="000000"/>
                 <w:sz w:val="22"/>
               </w:rPr>
+              <w:t>Om Khanjodkar</w:t>
             </w:r>
           </w:p>
         </w:tc>
@@ -290,6 +291,7 @@
                 <w:color w:val="000000"/>
                 <w:sz w:val="22"/>
               </w:rPr>
+              <w:t>125B1B283</w:t>
             </w:r>
           </w:p>
         </w:tc>
@@ -309,6 +311,7 @@
                 <w:color w:val="000000"/>
                 <w:sz w:val="22"/>
               </w:rPr>
+              <w:t>B.Tech</w:t>
             </w:r>
           </w:p>
         </w:tc>
@@ -351,6 +354,7 @@
                 <w:color w:val="000000"/>
                 <w:sz w:val="22"/>
               </w:rPr>
+              <w:t>Siddhant Verma</w:t>
             </w:r>
           </w:p>
         </w:tc>
@@ -370,6 +374,7 @@
                 <w:color w:val="000000"/>
                 <w:sz w:val="22"/>
               </w:rPr>
+              <w:t>125B1B278</w:t>
             </w:r>
           </w:p>
         </w:tc>
@@ -389,6 +394,7 @@
                 <w:color w:val="000000"/>
                 <w:sz w:val="22"/>
               </w:rPr>
+              <w:t>B.Tech</w:t>
             </w:r>
           </w:p>
         </w:tc>
@@ -431,6 +437,7 @@
                 <w:color w:val="000000"/>
                 <w:sz w:val="22"/>
               </w:rPr>
+              <w:t>Parth Ghumade</w:t>
             </w:r>
           </w:p>
         </w:tc>
@@ -450,6 +457,7 @@
                 <w:color w:val="000000"/>
                 <w:sz w:val="22"/>
               </w:rPr>
+              <w:t>125B1B234</w:t>
             </w:r>
           </w:p>
         </w:tc>
@@ -469,6 +477,90 @@
                 <w:color w:val="000000"/>
                 <w:sz w:val="22"/>
               </w:rPr>
+              <w:t>B.Tech</w:t>
+            </w:r>
+          </w:p>
+        </w:tc>
+      </w:tr>
+      <w:tr>
+        <w:tc>
+          <w:tcPr>
+            <w:tcW w:type="dxa" w:w="907"/>
+          </w:tcPr>
+          <w:p>
+            <w:pPr>
+              <w:spacing w:before="20" w:after="20"/>
+              <w:jc w:val="center"/>
+            </w:pPr>
+            <w:r/>
+            <w:r>
+              <w:rPr>
+                <w:rFonts w:ascii="Times New Roman" w:hAnsi="Times New Roman"/>
+                <w:b w:val="0"/>
+                <w:color w:val="000000"/>
+                <w:sz w:val="22"/>
+              </w:rPr>
+              <w:t>4.</w:t>
+            </w:r>
+          </w:p>
+        </w:tc>
+        <w:tc>
+          <w:tcPr>
+            <w:tcW w:type="dxa" w:w="3969"/>
+          </w:tcPr>
+          <w:p>
+            <w:pPr>
+              <w:spacing w:before="20" w:after="20"/>
+            </w:pPr>
+            <w:r/>
+            <w:r>
+              <w:rPr>
+                <w:rFonts w:ascii="Times New Roman" w:hAnsi="Times New Roman"/>
+                <w:b w:val="0"/>
+                <w:color w:val="000000"/>
+                <w:sz w:val="22"/>
+              </w:rPr>
+              <w:t>Tanishk Malge</w:t>
+            </w:r>
+          </w:p>
+        </w:tc>
+        <w:tc>
+          <w:tcPr>
+            <w:tcW w:type="dxa" w:w="2381"/>
+          </w:tcPr>
+          <w:p>
+            <w:pPr>
+              <w:spacing w:before="20" w:after="20"/>
+            </w:pPr>
+            <w:r/>
+            <w:r>
+              <w:rPr>
+                <w:rFonts w:ascii="Times New Roman" w:hAnsi="Times New Roman"/>
+                <w:b w:val="0"/>
+                <w:color w:val="000000"/>
+                <w:sz w:val="22"/>
+              </w:rPr>
+              <w:t>125B1B247</w:t>
+            </w:r>
+          </w:p>
+        </w:tc>
+        <w:tc>
+          <w:tcPr>
+            <w:tcW w:type="dxa" w:w="2381"/>
+          </w:tcPr>
+          <w:p>
+            <w:pPr>
+              <w:spacing w:before="20" w:after="20"/>
+            </w:pPr>
+            <w:r/>
+            <w:r>
+              <w:rPr>
+                <w:rFonts w:ascii="Times New Roman" w:hAnsi="Times New Roman"/>
+                <w:b w:val="0"/>
+                <w:color w:val="000000"/>
+                <w:sz w:val="22"/>
+              </w:rPr>
+              <w:t>B.Tech</w:t>
             </w:r>
           </w:p>
         </w:tc>
@@ -583,7 +675,7 @@
           <w:color w:val="000000"/>
           <w:sz w:val="24"/>
         </w:rPr>
-        <w:t>THOR Vietnam War bombing operations database (Combat Archives, THOR project). File: THOR_Vietnam_Bombing_Operations.csv. The file is public research data on weapon-delivery records of the air campaign in South-East Asia.</w:t>
+        <w:t>The project uses the THOR Vietnam War bombing operations database (Combat Archives, THOR project), file THOR_Vietnam_Bombing_Operations.csv. It is public research data that lists weapon-delivery records of the air campaign in South-East Asia.</w:t>
       </w:r>
     </w:p>
     <w:p>
@@ -614,7 +706,7 @@
           <w:color w:val="000000"/>
           <w:sz w:val="24"/>
         </w:rPr>
-        <w:t>The file contains 46,70,416 records (rows) and 47 columns covering mission dates from 1 June 1965 to 30 June 1975. One row is one weapon delivery event as reported by one source database (SEADAB, CACTA6669, CACTA6570 or SACCOACT); the column SOURCERECORD identifies the source. The columns are listed below together with the share of values missing in the full file (computed by a complete scan of the file, script scripts/00_profile_raw.R).</w:t>
+        <w:t>The raw file has 46,70,416 rows and 47 columns and covers missions from 1 June 1965 to 30 June 1975. Each row is one weapon-delivery event as reported by one of four source databases (SEADAB, CACTA6669, CACTA6570 or SACCOACT); the SOURCERECORD column says which one. The columns and the share of missing values in the full file (measured by scanning the whole file with scripts/00_profile_raw.R) are listed below.</w:t>
       </w:r>
     </w:p>
     <w:tbl>
@@ -5729,7 +5821,7 @@
           <w:color w:val="000000"/>
           <w:sz w:val="24"/>
         </w:rPr>
-        <w:t>The 47-column file mixes four source databases and contains records that did not deliver any weapon (for example jettison or return only sorties). The following steps were applied (script scripts/01_clean.R):</w:t>
+        <w:t>The 47-column file mixes four source databases and also holds records that delivered no weapon at all (jettison or return-only sorties, for example). The analysis file was built from it in three steps (script scripts/01_clean.R):</w:t>
       </w:r>
     </w:p>
     <w:p>
@@ -5746,7 +5838,7 @@
           <w:color w:val="000000"/>
           <w:sz w:val="24"/>
         </w:rPr>
-        <w:t>•  Step 1 - Population. The full file was scanned and the 23,46,224 records with NUMWEAPONSDELIVERED &gt; 0 (50.24% of the file) were kept. These are the records in which a weapon was actually delivered, which is the subject of the study.</w:t>
+        <w:t>•  Step 1 - Population. A full scan of the file kept the 23,46,224 records with NUMWEAPONSDELIVERED &gt; 0 (50.24% of the file) - the records in which a weapon was actually delivered, which is what this study is about.</w:t>
       </w:r>
     </w:p>
     <w:p>
@@ -5763,7 +5855,7 @@
           <w:color w:val="000000"/>
           <w:sz w:val="24"/>
         </w:rPr>
-        <w:t>•  Step 2 - Sampling. A simple random sample without replacement of 20,000 records was drawn from those 23,46,224 records (set.seed(2026)). Working on a random sample keeps every run of the scripts fast while the sample is still large enough for every test in this report.</w:t>
+        <w:t>•  Step 2 - Sampling. A simple random sample without replacement of 20,000 records was drawn from those 23,46,224 (set.seed(2026)). A random sample keeps every script fast to run while staying large enough for all the tests in this report.</w:t>
       </w:r>
     </w:p>
     <w:p>
@@ -5780,7 +5872,7 @@
           <w:color w:val="000000"/>
           <w:sz w:val="24"/>
         </w:rPr>
-        <w:t>•  Step 3 - Cleaning and derivation. The sample was cleaned and the analysis variables were derived; the result is clean_data.csv (20,000 records, 47 raw plus 17 derived columns) and a data-quality log (outputs/01_data_quality.txt).</w:t>
+        <w:t>•  Step 3 - Cleaning and derivation. The sample was cleaned and the analysis variables were derived, giving clean_data.csv (20,000 records, 47 raw plus 17 derived columns) and a data-quality log in outputs/01_data_quality.txt.</w:t>
       </w:r>
     </w:p>
     <w:p>
@@ -6919,7 +7011,7 @@
           <w:color w:val="000000"/>
           <w:sz w:val="24"/>
         </w:rPr>
-        <w:t>The weapon load (LOAD_LB) is recorded only in the SEADAB source, which is why 70.5% of the sample has no load; every problem that uses the load states this and analyses only the records where it is known. The cloud cover is missing for more than half of the records because ground reports often did not observe it.</w:t>
+        <w:t>Two gaps matter more than the rest. The weapon load (LOAD_LB) exists only in the SEADAB source, so 70.5% of the sample has no load; every problem that uses the load says so and works only with the records where it is known. Cloud cover is missing for more than half of the records because the ground reports often did not observe it.</w:t>
       </w:r>
     </w:p>
     <w:p>
@@ -6951,7 +7043,7 @@
           <w:color w:val="000000"/>
           <w:sz w:val="24"/>
         </w:rPr>
-        <w:t>•  One record is one delivery event as reported by one source, not one mission. A single mission can produce several records, so records are not fully independent. The p-values in the tests are therefore slightly optimistic; the effect sizes are quoted for this reason.</w:t>
+        <w:t>•  A record is one delivery event as reported by one source, not one mission. A mission can produce several records, so the records are not fully independent and the p-values are slightly optimistic; this is why the effect sizes are quoted alongside them.</w:t>
       </w:r>
     </w:p>
     <w:p>
@@ -6968,7 +7060,7 @@
           <w:color w:val="000000"/>
           <w:sz w:val="24"/>
         </w:rPr>
-        <w:t>•  The four source databases overlap in time and purpose; the database merges them without deduplication flags, so double counting of unusual events cannot be fully excluded.</w:t>
+        <w:t>•  The four source databases overlap in time and purpose, and the merged file has no de-duplication flags, so double counting of unusual events cannot be ruled out completely.</w:t>
       </w:r>
     </w:p>
     <w:p>
@@ -6985,7 +7077,7 @@
           <w:color w:val="000000"/>
           <w:sz w:val="24"/>
         </w:rPr>
-        <w:t>•  Weapons loaded weight is recorded only in SEADAB; results about the load apply to that source only.</w:t>
+        <w:t>•  The weapon load is recorded only in SEADAB, so every load result applies to that source only.</w:t>
       </w:r>
     </w:p>
     <w:p>
@@ -7002,7 +7094,7 @@
           <w:color w:val="000000"/>
           <w:sz w:val="24"/>
         </w:rPr>
-        <w:t>•  The source data are historical reports of the war; recorded numbers (weapons, aircraft) are the numbers reported at the time.</w:t>
+        <w:t>•  The source data are historical war reports: the numbers of weapons and aircraft are the numbers reported at the time, not later corrections.</w:t>
       </w:r>
     </w:p>
     <w:p>
@@ -17155,7 +17247,8 @@
     </w:p>
     <w:p>
       <w:pPr>
-        <w:spacing w:before="0" w:after="120"/>
+        <w:spacing w:before="0" w:after="60"/>
+        <w:ind w:left="425" w:hanging="312"/>
         <w:jc w:val="both"/>
       </w:pPr>
       <w:r>
@@ -17166,7 +17259,109 @@
           <w:color w:val="000000"/>
           <w:sz w:val="24"/>
         </w:rPr>
-        <w:t>R 4.6.1 with RStudio-compatible plain scripts. Packages: readr (chunked reading of the large raw file), ggplot2 (all figures, black-and-white theme), base R statistics (lm, t.test, chisq.test, shapiro.test, wilcox.test). The Levene test, the moment-based skewness/kurtosis and the variance inflation calculation are implemented in base R in scripts/common_setup.R so that the project runs with the standard library only. File map: scripts/00_profile_raw.R and 00b/00c (profiling the raw file), scripts/01_clean.R (builds clean_data.csv), scripts/problem1.R to problem5.R (one script per problem statement), outputs/ (text logs used in this report), figures/ (all graphs).</w:t>
+        <w:t>•  R 4.6.1, run as plain scripts in RStudio.</w:t>
+      </w:r>
+    </w:p>
+    <w:p>
+      <w:pPr>
+        <w:spacing w:before="0" w:after="60"/>
+        <w:ind w:left="425" w:hanging="312"/>
+        <w:jc w:val="both"/>
+      </w:pPr>
+      <w:r>
+        <w:rPr>
+          <w:rFonts w:ascii="Times New Roman" w:hAnsi="Times New Roman"/>
+          <w:b w:val="0"/>
+          <w:i w:val="0"/>
+          <w:color w:val="000000"/>
+          <w:sz w:val="24"/>
+        </w:rPr>
+        <w:t>•  readr - reads the large raw file in chunks.</w:t>
+      </w:r>
+    </w:p>
+    <w:p>
+      <w:pPr>
+        <w:spacing w:before="0" w:after="60"/>
+        <w:ind w:left="425" w:hanging="312"/>
+        <w:jc w:val="both"/>
+      </w:pPr>
+      <w:r>
+        <w:rPr>
+          <w:rFonts w:ascii="Times New Roman" w:hAnsi="Times New Roman"/>
+          <w:b w:val="0"/>
+          <w:i w:val="0"/>
+          <w:color w:val="000000"/>
+          <w:sz w:val="24"/>
+        </w:rPr>
+        <w:t>•  ggplot2 - produces every figure in a black-and-white theme.</w:t>
+      </w:r>
+    </w:p>
+    <w:p>
+      <w:pPr>
+        <w:spacing w:before="0" w:after="60"/>
+        <w:ind w:left="425" w:hanging="312"/>
+        <w:jc w:val="both"/>
+      </w:pPr>
+      <w:r>
+        <w:rPr>
+          <w:rFonts w:ascii="Times New Roman" w:hAnsi="Times New Roman"/>
+          <w:b w:val="0"/>
+          <w:i w:val="0"/>
+          <w:color w:val="000000"/>
+          <w:sz w:val="24"/>
+        </w:rPr>
+        <w:t>•  Base R statistics - lm, t.test, chisq.test, shapiro.test and wilcox.test.</w:t>
+      </w:r>
+    </w:p>
+    <w:p>
+      <w:pPr>
+        <w:spacing w:before="0" w:after="60"/>
+        <w:ind w:left="425" w:hanging="312"/>
+        <w:jc w:val="both"/>
+      </w:pPr>
+      <w:r>
+        <w:rPr>
+          <w:rFonts w:ascii="Times New Roman" w:hAnsi="Times New Roman"/>
+          <w:b w:val="0"/>
+          <w:i w:val="0"/>
+          <w:color w:val="000000"/>
+          <w:sz w:val="24"/>
+        </w:rPr>
+        <w:t>•  Base R custom code - Levene's test, the moment-based skewness/kurtosis and the variance inflation factors are written by hand in scripts/common_setup.R, so the project needs no package beyond the two above.</w:t>
+      </w:r>
+    </w:p>
+    <w:p>
+      <w:pPr>
+        <w:spacing w:before="0" w:after="60"/>
+        <w:ind w:left="425" w:hanging="312"/>
+        <w:jc w:val="both"/>
+      </w:pPr>
+      <w:r>
+        <w:rPr>
+          <w:rFonts w:ascii="Times New Roman" w:hAnsi="Times New Roman"/>
+          <w:b w:val="0"/>
+          <w:i w:val="0"/>
+          <w:color w:val="000000"/>
+          <w:sz w:val="24"/>
+        </w:rPr>
+        <w:t>•  Scripts - 00_profile_raw.R with 00b/00c profile the raw file, 01_clean.R builds clean_data.csv, and problem1.R to problem5.R each handle one problem statement.</w:t>
+      </w:r>
+    </w:p>
+    <w:p>
+      <w:pPr>
+        <w:spacing w:before="0" w:after="60"/>
+        <w:ind w:left="425" w:hanging="312"/>
+        <w:jc w:val="both"/>
+      </w:pPr>
+      <w:r>
+        <w:rPr>
+          <w:rFonts w:ascii="Times New Roman" w:hAnsi="Times New Roman"/>
+          <w:b w:val="0"/>
+          <w:i w:val="0"/>
+          <w:color w:val="000000"/>
+          <w:sz w:val="24"/>
+        </w:rPr>
+        <w:t>•  Outputs - outputs/ holds the text logs quoted in this report, figures/ holds all graphs, and report/ holds this document and its PDF.</w:t>
       </w:r>
     </w:p>
     <w:sectPr>

</xml_diff>

<commit_message>
Report: align with official FA-2 format (logo, page border, page numbers, Flow)
</commit_message>
<xml_diff>
--- a/report/report.docx
+++ b/report/report.docx
@@ -36,6 +36,46 @@
     </w:p>
     <w:p>
       <w:pPr>
+        <w:spacing w:before="80" w:after="80"/>
+        <w:jc w:val="center"/>
+      </w:pPr>
+      <w:r>
+        <w:drawing>
+          <wp:inline xmlns:a="http://schemas.openxmlformats.org/drawingml/2006/main" xmlns:pic="http://schemas.openxmlformats.org/drawingml/2006/picture">
+            <wp:extent cx="1224000" cy="1039208"/>
+            <wp:docPr id="1" name="Picture 1"/>
+            <wp:cNvGraphicFramePr>
+              <a:graphicFrameLocks noChangeAspect="1"/>
+            </wp:cNvGraphicFramePr>
+            <a:graphic>
+              <a:graphicData uri="http://schemas.openxmlformats.org/drawingml/2006/picture">
+                <pic:pic>
+                  <pic:nvPicPr>
+                    <pic:cNvPr id="0" name="pccoe_logo.png"/>
+                    <pic:cNvPicPr/>
+                  </pic:nvPicPr>
+                  <pic:blipFill>
+                    <a:blip r:embed="rId10"/>
+                    <a:stretch>
+                      <a:fillRect/>
+                    </a:stretch>
+                  </pic:blipFill>
+                  <pic:spPr>
+                    <a:xfrm>
+                      <a:off x="0" y="0"/>
+                      <a:ext cx="1224000" cy="1039208"/>
+                    </a:xfrm>
+                    <a:prstGeom prst="rect"/>
+                  </pic:spPr>
+                </pic:pic>
+              </a:graphicData>
+            </a:graphic>
+          </wp:inline>
+        </w:drawing>
+      </w:r>
+    </w:p>
+    <w:p>
+      <w:pPr>
         <w:spacing w:before="0" w:after="360"/>
         <w:jc w:val="center"/>
       </w:pPr>
@@ -47,7 +87,7 @@
           <w:color w:val="000000"/>
           <w:sz w:val="26"/>
         </w:rPr>
-        <w:t>Department of Applied Science and Humanities (AS&amp;H)</w:t>
+        <w:t>Department of AS&amp;H</w:t>
       </w:r>
     </w:p>
     <w:p>
@@ -634,7 +674,7 @@
     <w:p>
       <w:pPr>
         <w:spacing w:before="0" w:after="200"/>
-        <w:jc w:val="both"/>
+        <w:jc w:val="center"/>
       </w:pPr>
       <w:r>
         <w:rPr>
@@ -642,7 +682,7 @@
           <w:b/>
           <w:i w:val="0"/>
           <w:color w:val="000000"/>
-          <w:sz w:val="24"/>
+          <w:sz w:val="30"/>
         </w:rPr>
         <w:t>Statistical Analysis of the Vietnam War Bombing Operations Data using R</w:t>
       </w:r>
@@ -706,7 +746,7 @@
           <w:color w:val="000000"/>
           <w:sz w:val="24"/>
         </w:rPr>
-        <w:t>The raw file has 46,70,416 rows and 47 columns and covers missions from 1 June 1965 to 30 June 1975. Each row is one weapon-delivery event as reported by one of four source databases (SEADAB, CACTA6669, CACTA6570 or SACCOACT); the SOURCERECORD column says which one. The columns and the share of missing values in the full file (measured by scanning the whole file with scripts/00_profile_raw.R) are listed below.</w:t>
+        <w:t>The raw file has 46,70,416 rows and 47 columns and covers missions from 1 June 1965 to 30 June 1975. Each row is one weapon-delivery event as reported by one of four source databases (SEADAB, CACTA6669, CACTA6570 or SACCOACT); the SOURCERECORD column says which one. The columns and the share of missing values in the full file (measured by scanning the whole file with scripts/00_profile_raw.R) are listed below. The analysis itself works with 8 numerical variables (YEAR, WEAPONS_DELIVERED, LOAD_LB, AIRCRAFT_NO, TGT_HOUR, LAT, LON, FLIGHT_HOURS) and 7 categorical ones (COUNTRY, PERIOD, AIRCRAFT_GROUP, SOURCE_DB, WEAPON_CLASS, CLOUD, SERVICE).</w:t>
       </w:r>
     </w:p>
     <w:tbl>
@@ -5786,6 +5826,139 @@
           <w:sz w:val="21"/>
         </w:rPr>
         <w:t>Table 1: Columns of the raw data file with the share of missing values in the full file.</w:t>
+      </w:r>
+    </w:p>
+    <w:p>
+      <w:pPr>
+        <w:spacing w:before="280" w:after="40"/>
+      </w:pPr>
+      <w:r>
+        <w:rPr>
+          <w:rFonts w:ascii="Times New Roman" w:hAnsi="Times New Roman"/>
+          <w:b/>
+          <w:i w:val="0"/>
+          <w:color w:val="000000"/>
+          <w:sz w:val="27"/>
+        </w:rPr>
+        <w:t>Flow</w:t>
+      </w:r>
+    </w:p>
+    <w:p>
+      <w:pPr>
+        <w:spacing w:before="0" w:after="60"/>
+        <w:ind w:left="425" w:hanging="312"/>
+        <w:jc w:val="both"/>
+      </w:pPr>
+      <w:r>
+        <w:rPr>
+          <w:rFonts w:ascii="Times New Roman" w:hAnsi="Times New Roman"/>
+          <w:b w:val="0"/>
+          <w:i w:val="0"/>
+          <w:color w:val="000000"/>
+          <w:sz w:val="24"/>
+        </w:rPr>
+        <w:t>•  Problem statement - what the question is and why it matters.</w:t>
+      </w:r>
+    </w:p>
+    <w:p>
+      <w:pPr>
+        <w:spacing w:before="0" w:after="60"/>
+        <w:ind w:left="425" w:hanging="312"/>
+        <w:jc w:val="both"/>
+      </w:pPr>
+      <w:r>
+        <w:rPr>
+          <w:rFonts w:ascii="Times New Roman" w:hAnsi="Times New Roman"/>
+          <w:b w:val="0"/>
+          <w:i w:val="0"/>
+          <w:color w:val="000000"/>
+          <w:sz w:val="24"/>
+        </w:rPr>
+        <w:t>•  Statistical analysis - the method, its hypotheses and its assumptions.</w:t>
+      </w:r>
+    </w:p>
+    <w:p>
+      <w:pPr>
+        <w:spacing w:before="0" w:after="60"/>
+        <w:ind w:left="425" w:hanging="312"/>
+        <w:jc w:val="both"/>
+      </w:pPr>
+      <w:r>
+        <w:rPr>
+          <w:rFonts w:ascii="Times New Roman" w:hAnsi="Times New Roman"/>
+          <w:b w:val="0"/>
+          <w:i w:val="0"/>
+          <w:color w:val="000000"/>
+          <w:sz w:val="24"/>
+        </w:rPr>
+        <w:t>•  Data visualization - the graph that shows the pattern, with its inference.</w:t>
+      </w:r>
+    </w:p>
+    <w:p>
+      <w:pPr>
+        <w:spacing w:before="0" w:after="60"/>
+        <w:ind w:left="425" w:hanging="312"/>
+        <w:jc w:val="both"/>
+      </w:pPr>
+      <w:r>
+        <w:rPr>
+          <w:rFonts w:ascii="Times New Roman" w:hAnsi="Times New Roman"/>
+          <w:b w:val="0"/>
+          <w:i w:val="0"/>
+          <w:color w:val="000000"/>
+          <w:sz w:val="24"/>
+        </w:rPr>
+        <w:t>•  Coding - the R script that produces every number and every figure.</w:t>
+      </w:r>
+    </w:p>
+    <w:p>
+      <w:pPr>
+        <w:spacing w:before="0" w:after="60"/>
+        <w:ind w:left="425" w:hanging="312"/>
+        <w:jc w:val="both"/>
+      </w:pPr>
+      <w:r>
+        <w:rPr>
+          <w:rFonts w:ascii="Times New Roman" w:hAnsi="Times New Roman"/>
+          <w:b w:val="0"/>
+          <w:i w:val="0"/>
+          <w:color w:val="000000"/>
+          <w:sz w:val="24"/>
+        </w:rPr>
+        <w:t>•  Correlation - where two numerical variables allow it.</w:t>
+      </w:r>
+    </w:p>
+    <w:p>
+      <w:pPr>
+        <w:spacing w:before="0" w:after="60"/>
+        <w:ind w:left="425" w:hanging="312"/>
+        <w:jc w:val="both"/>
+      </w:pPr>
+      <w:r>
+        <w:rPr>
+          <w:rFonts w:ascii="Times New Roman" w:hAnsi="Times New Roman"/>
+          <w:b w:val="0"/>
+          <w:i w:val="0"/>
+          <w:color w:val="000000"/>
+          <w:sz w:val="24"/>
+        </w:rPr>
+        <w:t>•  Hypothesis testing with proper sampling - the test, the p-value and the effect size.</w:t>
+      </w:r>
+    </w:p>
+    <w:p>
+      <w:pPr>
+        <w:spacing w:before="0" w:after="200"/>
+        <w:jc w:val="both"/>
+      </w:pPr>
+      <w:r>
+        <w:rPr>
+          <w:rFonts w:ascii="Times New Roman" w:hAnsi="Times New Roman"/>
+          <w:b w:val="0"/>
+          <w:i w:val="0"/>
+          <w:color w:val="000000"/>
+          <w:sz w:val="24"/>
+        </w:rPr>
+        <w:t>Each of the five problem statements below follows this flow, and each one is backed by an R script whose output is quoted in the text.</w:t>
       </w:r>
     </w:p>
     <w:p>
@@ -10539,7 +10712,7 @@
         <w:drawing>
           <wp:inline xmlns:a="http://schemas.openxmlformats.org/drawingml/2006/main" xmlns:pic="http://schemas.openxmlformats.org/drawingml/2006/picture">
             <wp:extent cx="4860000" cy="3092727"/>
-            <wp:docPr id="1" name="Picture 1"/>
+            <wp:docPr id="2" name="Picture 2"/>
             <wp:cNvGraphicFramePr>
               <a:graphicFrameLocks noChangeAspect="1"/>
             </wp:cNvGraphicFramePr>
@@ -10551,7 +10724,7 @@
                     <pic:cNvPicPr/>
                   </pic:nvPicPr>
                   <pic:blipFill>
-                    <a:blip r:embed="rId9"/>
+                    <a:blip r:embed="rId11"/>
                     <a:stretch>
                       <a:fillRect/>
                     </a:stretch>
@@ -10611,7 +10784,7 @@
         <w:drawing>
           <wp:inline xmlns:a="http://schemas.openxmlformats.org/drawingml/2006/main" xmlns:pic="http://schemas.openxmlformats.org/drawingml/2006/picture">
             <wp:extent cx="5220000" cy="3480000"/>
-            <wp:docPr id="2" name="Picture 2"/>
+            <wp:docPr id="3" name="Picture 3"/>
             <wp:cNvGraphicFramePr>
               <a:graphicFrameLocks noChangeAspect="1"/>
             </wp:cNvGraphicFramePr>
@@ -10623,7 +10796,7 @@
                     <pic:cNvPicPr/>
                   </pic:nvPicPr>
                   <pic:blipFill>
-                    <a:blip r:embed="rId10"/>
+                    <a:blip r:embed="rId12"/>
                     <a:stretch>
                       <a:fillRect/>
                     </a:stretch>
@@ -10683,7 +10856,7 @@
         <w:drawing>
           <wp:inline xmlns:a="http://schemas.openxmlformats.org/drawingml/2006/main" xmlns:pic="http://schemas.openxmlformats.org/drawingml/2006/picture">
             <wp:extent cx="4860000" cy="3092727"/>
-            <wp:docPr id="3" name="Picture 3"/>
+            <wp:docPr id="4" name="Picture 4"/>
             <wp:cNvGraphicFramePr>
               <a:graphicFrameLocks noChangeAspect="1"/>
             </wp:cNvGraphicFramePr>
@@ -10695,7 +10868,7 @@
                     <pic:cNvPicPr/>
                   </pic:nvPicPr>
                   <pic:blipFill>
-                    <a:blip r:embed="rId11"/>
+                    <a:blip r:embed="rId13"/>
                     <a:stretch>
                       <a:fillRect/>
                     </a:stretch>
@@ -10755,7 +10928,7 @@
         <w:drawing>
           <wp:inline xmlns:a="http://schemas.openxmlformats.org/drawingml/2006/main" xmlns:pic="http://schemas.openxmlformats.org/drawingml/2006/picture">
             <wp:extent cx="4860000" cy="3387273"/>
-            <wp:docPr id="4" name="Picture 4"/>
+            <wp:docPr id="5" name="Picture 5"/>
             <wp:cNvGraphicFramePr>
               <a:graphicFrameLocks noChangeAspect="1"/>
             </wp:cNvGraphicFramePr>
@@ -10767,7 +10940,7 @@
                     <pic:cNvPicPr/>
                   </pic:nvPicPr>
                   <pic:blipFill>
-                    <a:blip r:embed="rId12"/>
+                    <a:blip r:embed="rId14"/>
                     <a:stretch>
                       <a:fillRect/>
                     </a:stretch>
@@ -10827,7 +11000,7 @@
         <w:drawing>
           <wp:inline xmlns:a="http://schemas.openxmlformats.org/drawingml/2006/main" xmlns:pic="http://schemas.openxmlformats.org/drawingml/2006/picture">
             <wp:extent cx="4500000" cy="3340909"/>
-            <wp:docPr id="5" name="Picture 5"/>
+            <wp:docPr id="6" name="Picture 6"/>
             <wp:cNvGraphicFramePr>
               <a:graphicFrameLocks noChangeAspect="1"/>
             </wp:cNvGraphicFramePr>
@@ -10839,7 +11012,7 @@
                     <pic:cNvPicPr/>
                   </pic:nvPicPr>
                   <pic:blipFill>
-                    <a:blip r:embed="rId13"/>
+                    <a:blip r:embed="rId15"/>
                     <a:stretch>
                       <a:fillRect/>
                     </a:stretch>
@@ -11670,7 +11843,7 @@
         <w:drawing>
           <wp:inline xmlns:a="http://schemas.openxmlformats.org/drawingml/2006/main" xmlns:pic="http://schemas.openxmlformats.org/drawingml/2006/picture">
             <wp:extent cx="4860000" cy="3092727"/>
-            <wp:docPr id="6" name="Picture 6"/>
+            <wp:docPr id="7" name="Picture 7"/>
             <wp:cNvGraphicFramePr>
               <a:graphicFrameLocks noChangeAspect="1"/>
             </wp:cNvGraphicFramePr>
@@ -11682,7 +11855,7 @@
                     <pic:cNvPicPr/>
                   </pic:nvPicPr>
                   <pic:blipFill>
-                    <a:blip r:embed="rId14"/>
+                    <a:blip r:embed="rId16"/>
                     <a:stretch>
                       <a:fillRect/>
                     </a:stretch>
@@ -11742,7 +11915,7 @@
         <w:drawing>
           <wp:inline xmlns:a="http://schemas.openxmlformats.org/drawingml/2006/main" xmlns:pic="http://schemas.openxmlformats.org/drawingml/2006/picture">
             <wp:extent cx="4860000" cy="3092727"/>
-            <wp:docPr id="7" name="Picture 7"/>
+            <wp:docPr id="8" name="Picture 8"/>
             <wp:cNvGraphicFramePr>
               <a:graphicFrameLocks noChangeAspect="1"/>
             </wp:cNvGraphicFramePr>
@@ -11754,7 +11927,7 @@
                     <pic:cNvPicPr/>
                   </pic:nvPicPr>
                   <pic:blipFill>
-                    <a:blip r:embed="rId15"/>
+                    <a:blip r:embed="rId17"/>
                     <a:stretch>
                       <a:fillRect/>
                     </a:stretch>
@@ -11798,7 +11971,7 @@
         <w:drawing>
           <wp:inline xmlns:a="http://schemas.openxmlformats.org/drawingml/2006/main" xmlns:pic="http://schemas.openxmlformats.org/drawingml/2006/picture">
             <wp:extent cx="4860000" cy="2945455"/>
-            <wp:docPr id="8" name="Picture 8"/>
+            <wp:docPr id="9" name="Picture 9"/>
             <wp:cNvGraphicFramePr>
               <a:graphicFrameLocks noChangeAspect="1"/>
             </wp:cNvGraphicFramePr>
@@ -11810,7 +11983,7 @@
                     <pic:cNvPicPr/>
                   </pic:nvPicPr>
                   <pic:blipFill>
-                    <a:blip r:embed="rId16"/>
+                    <a:blip r:embed="rId18"/>
                     <a:stretch>
                       <a:fillRect/>
                     </a:stretch>
@@ -12228,7 +12401,7 @@
         <w:drawing>
           <wp:inline xmlns:a="http://schemas.openxmlformats.org/drawingml/2006/main" xmlns:pic="http://schemas.openxmlformats.org/drawingml/2006/picture">
             <wp:extent cx="5040000" cy="3665455"/>
-            <wp:docPr id="9" name="Picture 9"/>
+            <wp:docPr id="10" name="Picture 10"/>
             <wp:cNvGraphicFramePr>
               <a:graphicFrameLocks noChangeAspect="1"/>
             </wp:cNvGraphicFramePr>
@@ -12240,7 +12413,7 @@
                     <pic:cNvPicPr/>
                   </pic:nvPicPr>
                   <pic:blipFill>
-                    <a:blip r:embed="rId17"/>
+                    <a:blip r:embed="rId19"/>
                     <a:stretch>
                       <a:fillRect/>
                     </a:stretch>
@@ -12300,7 +12473,7 @@
         <w:drawing>
           <wp:inline xmlns:a="http://schemas.openxmlformats.org/drawingml/2006/main" xmlns:pic="http://schemas.openxmlformats.org/drawingml/2006/picture">
             <wp:extent cx="5040000" cy="3207273"/>
-            <wp:docPr id="10" name="Picture 10"/>
+            <wp:docPr id="11" name="Picture 11"/>
             <wp:cNvGraphicFramePr>
               <a:graphicFrameLocks noChangeAspect="1"/>
             </wp:cNvGraphicFramePr>
@@ -12312,7 +12485,7 @@
                     <pic:cNvPicPr/>
                   </pic:nvPicPr>
                   <pic:blipFill>
-                    <a:blip r:embed="rId18"/>
+                    <a:blip r:embed="rId20"/>
                     <a:stretch>
                       <a:fillRect/>
                     </a:stretch>
@@ -13237,7 +13410,7 @@
         <w:drawing>
           <wp:inline xmlns:a="http://schemas.openxmlformats.org/drawingml/2006/main" xmlns:pic="http://schemas.openxmlformats.org/drawingml/2006/picture">
             <wp:extent cx="4320000" cy="3821538"/>
-            <wp:docPr id="11" name="Picture 11"/>
+            <wp:docPr id="12" name="Picture 12"/>
             <wp:cNvGraphicFramePr>
               <a:graphicFrameLocks noChangeAspect="1"/>
             </wp:cNvGraphicFramePr>
@@ -13249,7 +13422,7 @@
                     <pic:cNvPicPr/>
                   </pic:nvPicPr>
                   <pic:blipFill>
-                    <a:blip r:embed="rId19"/>
+                    <a:blip r:embed="rId21"/>
                     <a:stretch>
                       <a:fillRect/>
                     </a:stretch>
@@ -13293,7 +13466,7 @@
         <w:drawing>
           <wp:inline xmlns:a="http://schemas.openxmlformats.org/drawingml/2006/main" xmlns:pic="http://schemas.openxmlformats.org/drawingml/2006/picture">
             <wp:extent cx="5040000" cy="2749091"/>
-            <wp:docPr id="12" name="Picture 12"/>
+            <wp:docPr id="13" name="Picture 13"/>
             <wp:cNvGraphicFramePr>
               <a:graphicFrameLocks noChangeAspect="1"/>
             </wp:cNvGraphicFramePr>
@@ -13305,7 +13478,7 @@
                     <pic:cNvPicPr/>
                   </pic:nvPicPr>
                   <pic:blipFill>
-                    <a:blip r:embed="rId20"/>
+                    <a:blip r:embed="rId22"/>
                     <a:stretch>
                       <a:fillRect/>
                     </a:stretch>
@@ -13349,7 +13522,7 @@
         <w:drawing>
           <wp:inline xmlns:a="http://schemas.openxmlformats.org/drawingml/2006/main" xmlns:pic="http://schemas.openxmlformats.org/drawingml/2006/picture">
             <wp:extent cx="4320000" cy="3024000"/>
-            <wp:docPr id="13" name="Picture 13"/>
+            <wp:docPr id="14" name="Picture 14"/>
             <wp:cNvGraphicFramePr>
               <a:graphicFrameLocks noChangeAspect="1"/>
             </wp:cNvGraphicFramePr>
@@ -13361,7 +13534,7 @@
                     <pic:cNvPicPr/>
                   </pic:nvPicPr>
                   <pic:blipFill>
-                    <a:blip r:embed="rId21"/>
+                    <a:blip r:embed="rId23"/>
                     <a:stretch>
                       <a:fillRect/>
                     </a:stretch>
@@ -14983,7 +15156,7 @@
         <w:drawing>
           <wp:inline xmlns:a="http://schemas.openxmlformats.org/drawingml/2006/main" xmlns:pic="http://schemas.openxmlformats.org/drawingml/2006/picture">
             <wp:extent cx="5040000" cy="3665455"/>
-            <wp:docPr id="14" name="Picture 14"/>
+            <wp:docPr id="15" name="Picture 15"/>
             <wp:cNvGraphicFramePr>
               <a:graphicFrameLocks noChangeAspect="1"/>
             </wp:cNvGraphicFramePr>
@@ -14995,7 +15168,7 @@
                     <pic:cNvPicPr/>
                   </pic:nvPicPr>
                   <pic:blipFill>
-                    <a:blip r:embed="rId22"/>
+                    <a:blip r:embed="rId24"/>
                     <a:stretch>
                       <a:fillRect/>
                     </a:stretch>
@@ -15039,7 +15212,7 @@
         <w:drawing>
           <wp:inline xmlns:a="http://schemas.openxmlformats.org/drawingml/2006/main" xmlns:pic="http://schemas.openxmlformats.org/drawingml/2006/picture">
             <wp:extent cx="5040000" cy="3665455"/>
-            <wp:docPr id="15" name="Picture 15"/>
+            <wp:docPr id="16" name="Picture 16"/>
             <wp:cNvGraphicFramePr>
               <a:graphicFrameLocks noChangeAspect="1"/>
             </wp:cNvGraphicFramePr>
@@ -15051,7 +15224,7 @@
                     <pic:cNvPicPr/>
                   </pic:nvPicPr>
                   <pic:blipFill>
-                    <a:blip r:embed="rId23"/>
+                    <a:blip r:embed="rId25"/>
                     <a:stretch>
                       <a:fillRect/>
                     </a:stretch>
@@ -15524,7 +15697,7 @@
         <w:drawing>
           <wp:inline xmlns:a="http://schemas.openxmlformats.org/drawingml/2006/main" xmlns:pic="http://schemas.openxmlformats.org/drawingml/2006/picture">
             <wp:extent cx="4860000" cy="3092727"/>
-            <wp:docPr id="16" name="Picture 16"/>
+            <wp:docPr id="17" name="Picture 17"/>
             <wp:cNvGraphicFramePr>
               <a:graphicFrameLocks noChangeAspect="1"/>
             </wp:cNvGraphicFramePr>
@@ -15536,7 +15709,7 @@
                     <pic:cNvPicPr/>
                   </pic:nvPicPr>
                   <pic:blipFill>
-                    <a:blip r:embed="rId24"/>
+                    <a:blip r:embed="rId26"/>
                     <a:stretch>
                       <a:fillRect/>
                     </a:stretch>
@@ -15580,7 +15753,7 @@
         <w:drawing>
           <wp:inline xmlns:a="http://schemas.openxmlformats.org/drawingml/2006/main" xmlns:pic="http://schemas.openxmlformats.org/drawingml/2006/picture">
             <wp:extent cx="4680000" cy="3261818"/>
-            <wp:docPr id="17" name="Picture 17"/>
+            <wp:docPr id="18" name="Picture 18"/>
             <wp:cNvGraphicFramePr>
               <a:graphicFrameLocks noChangeAspect="1"/>
             </wp:cNvGraphicFramePr>
@@ -15592,7 +15765,7 @@
                     <pic:cNvPicPr/>
                   </pic:nvPicPr>
                   <pic:blipFill>
-                    <a:blip r:embed="rId25"/>
+                    <a:blip r:embed="rId27"/>
                     <a:stretch>
                       <a:fillRect/>
                     </a:stretch>
@@ -16805,7 +16978,7 @@
         <w:drawing>
           <wp:inline xmlns:a="http://schemas.openxmlformats.org/drawingml/2006/main" xmlns:pic="http://schemas.openxmlformats.org/drawingml/2006/picture">
             <wp:extent cx="4680000" cy="2978182"/>
-            <wp:docPr id="18" name="Picture 18"/>
+            <wp:docPr id="19" name="Picture 19"/>
             <wp:cNvGraphicFramePr>
               <a:graphicFrameLocks noChangeAspect="1"/>
             </wp:cNvGraphicFramePr>
@@ -16817,7 +16990,7 @@
                     <pic:cNvPicPr/>
                   </pic:nvPicPr>
                   <pic:blipFill>
-                    <a:blip r:embed="rId26"/>
+                    <a:blip r:embed="rId28"/>
                     <a:stretch>
                       <a:fillRect/>
                     </a:stretch>
@@ -16861,7 +17034,7 @@
         <w:drawing>
           <wp:inline xmlns:a="http://schemas.openxmlformats.org/drawingml/2006/main" xmlns:pic="http://schemas.openxmlformats.org/drawingml/2006/picture">
             <wp:extent cx="4320000" cy="2749091"/>
-            <wp:docPr id="19" name="Picture 19"/>
+            <wp:docPr id="20" name="Picture 20"/>
             <wp:cNvGraphicFramePr>
               <a:graphicFrameLocks noChangeAspect="1"/>
             </wp:cNvGraphicFramePr>
@@ -16873,7 +17046,7 @@
                     <pic:cNvPicPr/>
                   </pic:nvPicPr>
                   <pic:blipFill>
-                    <a:blip r:embed="rId27"/>
+                    <a:blip r:embed="rId29"/>
                     <a:stretch>
                       <a:fillRect/>
                     </a:stretch>
@@ -17365,13 +17538,52 @@
       </w:r>
     </w:p>
     <w:sectPr>
+      <w:footerReference w:type="default" r:id="rId9"/>
       <w:pgSz w:w="11906" w:h="16838"/>
       <w:pgMar w:top="1134" w:right="1134" w:bottom="1134" w:left="1134" w:header="720" w:footer="720" w:gutter="0"/>
+      <w:pgBorders w:offsetFrom="page">
+        <w:top w:val="single" w:sz="4" w:space="24" w:color="auto"/>
+        <w:left w:val="single" w:sz="4" w:space="24" w:color="auto"/>
+        <w:bottom w:val="single" w:sz="4" w:space="24" w:color="auto"/>
+        <w:right w:val="single" w:sz="4" w:space="24" w:color="auto"/>
+      </w:pgBorders>
       <w:cols w:space="720"/>
+      <w:titlePg/>
       <w:docGrid w:linePitch="360"/>
     </w:sectPr>
   </w:body>
 </w:document>
+</file>
+
+<file path=word/footer1.xml><?xml version="1.0" encoding="utf-8"?>
+<w:ftr xmlns:m="http://schemas.openxmlformats.org/officeDocument/2006/math" xmlns:mc="http://schemas.openxmlformats.org/markup-compatibility/2006" xmlns:mo="http://schemas.microsoft.com/office/mac/office/2008/main" xmlns:mv="urn:schemas-microsoft-com:mac:vml" xmlns:o="urn:schemas-microsoft-com:office:office" xmlns:r="http://schemas.openxmlformats.org/officeDocument/2006/relationships" xmlns:v="urn:schemas-microsoft-com:vml" xmlns:w10="urn:schemas-microsoft-com:office:word" xmlns:w14="http://schemas.microsoft.com/office/word/2010/wordml" xmlns:w="http://schemas.openxmlformats.org/wordprocessingml/2006/main" xmlns:wne="http://schemas.microsoft.com/office/word/2006/wordml" xmlns:wp14="http://schemas.microsoft.com/office/word/2010/wordprocessingDrawing" xmlns:wp="http://schemas.openxmlformats.org/drawingml/2006/wordprocessingDrawing" xmlns:wpc="http://schemas.microsoft.com/office/word/2010/wordprocessingCanvas" xmlns:wpg="http://schemas.microsoft.com/office/word/2010/wordprocessingGroup" xmlns:wpi="http://schemas.microsoft.com/office/word/2010/wordprocessingInk" xmlns:wps="http://schemas.microsoft.com/office/word/2010/wordprocessingShape" mc:Ignorable="w14 wp14">
+  <w:p>
+    <w:pPr>
+      <w:pStyle w:val="Footer"/>
+      <w:spacing w:before="0" w:after="0"/>
+      <w:jc w:val="center"/>
+    </w:pPr>
+    <w:r>
+      <w:fldChar w:fldCharType="begin"/>
+    </w:r>
+    <w:r>
+      <w:instrText xml:space="preserve"> PAGE  \* MERGEFORMAT </w:instrText>
+    </w:r>
+    <w:r>
+      <w:fldChar w:fldCharType="separate"/>
+    </w:r>
+    <w:r>
+      <w:rPr>
+        <w:rFonts w:ascii="Times New Roman" w:hAnsi="Times New Roman"/>
+        <w:sz w:val="22"/>
+      </w:rPr>
+      <w:t>1</w:t>
+    </w:r>
+    <w:r>
+      <w:fldChar w:fldCharType="end"/>
+    </w:r>
+  </w:p>
+</w:ftr>
 </file>
 
 <file path=word/numbering.xml><?xml version="1.0" encoding="utf-8"?>

</xml_diff>

<commit_message>
Add RStudio project file and demo guide; align cover with sample report
</commit_message>
<xml_diff>
--- a/report/report.docx
+++ b/report/report.docx
@@ -87,7 +87,7 @@
           <w:color w:val="000000"/>
           <w:sz w:val="26"/>
         </w:rPr>
-        <w:t>Department of AS&amp;H</w:t>
+        <w:t>Department of Applied Science and Humanities</w:t>
       </w:r>
     </w:p>
     <w:p>
@@ -7829,7 +7829,7 @@
           <w:color w:val="000000"/>
           <w:sz w:val="24"/>
         </w:rPr>
-        <w:t>Output with description</w:t>
+        <w:t>Output with Description</w:t>
       </w:r>
     </w:p>
     <w:p>
@@ -11374,7 +11374,7 @@
           <w:color w:val="000000"/>
           <w:sz w:val="24"/>
         </w:rPr>
-        <w:t>Output with description</w:t>
+        <w:t>Output with Description</w:t>
       </w:r>
     </w:p>
     <w:tbl>
@@ -12847,7 +12847,7 @@
           <w:color w:val="000000"/>
           <w:sz w:val="24"/>
         </w:rPr>
-        <w:t>Output with description</w:t>
+        <w:t>Output with Description</w:t>
       </w:r>
     </w:p>
     <w:tbl>
@@ -13961,7 +13961,7 @@
           <w:color w:val="000000"/>
           <w:sz w:val="24"/>
         </w:rPr>
-        <w:t>Output with description</w:t>
+        <w:t>Output with Description</w:t>
       </w:r>
     </w:p>
     <w:tbl>
@@ -15669,7 +15669,7 @@
           <w:color w:val="000000"/>
           <w:sz w:val="24"/>
         </w:rPr>
-        <w:t>Output with description</w:t>
+        <w:t>Output with Description</w:t>
       </w:r>
     </w:p>
     <w:p>

</xml_diff>